<commit_message>
fgg gg g g  ggggg
</commit_message>
<xml_diff>
--- a/Articles_POR.docx
+++ b/Articles_POR.docx
@@ -920,6 +920,10 @@
       </w:r>
       <w:proofErr w:type="spellStart"/>
       <w:r>
+        <w:rPr>
+          <w:b/>
+          <w:bCs/>
+        </w:rPr>
         <w:t>Genismo</w:t>
       </w:r>
       <w:proofErr w:type="spellEnd"/>
@@ -1925,6 +1929,20 @@
           <w:t>https://jocaxx.github.io/DUniverse/PORT/DIF_KIMI_POR_2.pdf</w:t>
         </w:r>
       </w:hyperlink>
+      <w:r>
+        <w:br/>
+      </w:r>
+      <w:r>
+        <w:br/>
+      </w:r>
+      <w:hyperlink r:id="rId24" w:history="1">
+        <w:r>
+          <w:rPr>
+            <w:rStyle w:val="Hyperlink"/>
+          </w:rPr>
+          <w:t>https://jocaxx.github.io/DUniverse/Html/POR_DIF_KIMI_2.htm</w:t>
+        </w:r>
+      </w:hyperlink>
     </w:p>
     <w:p>
       <w:pPr>
@@ -2200,7 +2218,7 @@
       <w:r>
         <w:t>.” (</w:t>
       </w:r>
-      <w:hyperlink r:id="rId24">
+      <w:hyperlink r:id="rId25">
         <w:r>
           <w:rPr>
             <w:rStyle w:val="Hyperlink"/>
@@ -2547,7 +2565,7 @@
           <w:bottom w:val="single" w:sz="6" w:space="1" w:color="auto"/>
         </w:pBdr>
       </w:pPr>
-      <w:hyperlink r:id="rId25" w:history="1">
+      <w:hyperlink r:id="rId26" w:history="1">
         <w:r>
           <w:rPr>
             <w:rStyle w:val="Hyperlink"/>
@@ -2995,7 +3013,7 @@
           <w:bottom w:val="single" w:sz="6" w:space="1" w:color="auto"/>
         </w:pBdr>
       </w:pPr>
-      <w:hyperlink r:id="rId26" w:history="1">
+      <w:hyperlink r:id="rId27" w:history="1">
         <w:r>
           <w:rPr>
             <w:rStyle w:val="Hyperlink"/>
@@ -3003,6 +3021,20 @@
           <w:t>https://jocaxx.github.io/DUniverse/PORT/DUT_Resumo_PT.pdf</w:t>
         </w:r>
       </w:hyperlink>
+      <w:r>
+        <w:br/>
+      </w:r>
+      <w:r>
+        <w:br/>
+      </w:r>
+      <w:hyperlink r:id="rId28" w:history="1">
+        <w:r>
+          <w:rPr>
+            <w:rStyle w:val="Hyperlink"/>
+          </w:rPr>
+          <w:t>https://jocaxx.github.io/DUniverse/Html/POR_DUT_Resumo.htm</w:t>
+        </w:r>
+      </w:hyperlink>
     </w:p>
     <w:p>
       <w:pPr>
@@ -3435,12 +3467,12 @@
           <w:bottom w:val="single" w:sz="6" w:space="1" w:color="auto"/>
         </w:pBdr>
       </w:pPr>
-      <w:hyperlink r:id="rId27" w:history="1">
+      <w:hyperlink r:id="rId29" w:history="1">
         <w:r>
           <w:rPr>
             <w:rStyle w:val="Hyperlink"/>
           </w:rPr>
-          <w:t>https://jocaxx.github.io/DUniverse/PORT//DUT_NGC1052.pdf</w:t>
+          <w:t>https://jocaxx.github.io/DUniverse/PORT/DUT_NGC1052.pdf</w:t>
         </w:r>
       </w:hyperlink>
     </w:p>
@@ -3451,553 +3483,14 @@
           <w:bottom w:val="single" w:sz="6" w:space="1" w:color="auto"/>
         </w:pBdr>
       </w:pPr>
-    </w:p>
-    <w:p>
-      <w:pPr>
-        <w:pStyle w:val="Corpodetexto"/>
-      </w:pPr>
-    </w:p>
-    <w:p>
-      <w:pPr>
-        <w:pStyle w:val="Corpodetexto"/>
-        <w:rPr>
-          <w:color w:val="17365D" w:themeColor="text2" w:themeShade="BF"/>
-          <w:sz w:val="28"/>
-          <w:szCs w:val="28"/>
-        </w:rPr>
-      </w:pPr>
-      <w:r>
-        <w:rPr>
-          <w:b/>
-          <w:bCs/>
-          <w:color w:val="17365D" w:themeColor="text2" w:themeShade="BF"/>
-          <w:sz w:val="28"/>
-          <w:szCs w:val="28"/>
-        </w:rPr>
-        <w:t>(</w:t>
-      </w:r>
-      <w:r>
-        <w:rPr>
-          <w:b/>
-          <w:bCs/>
-          <w:color w:val="EE0000"/>
-          <w:sz w:val="28"/>
-          <w:szCs w:val="28"/>
-        </w:rPr>
-        <w:t>*</w:t>
-      </w:r>
-      <w:r>
-        <w:rPr>
-          <w:b/>
-          <w:bCs/>
-          <w:color w:val="17365D" w:themeColor="text2" w:themeShade="BF"/>
-          <w:sz w:val="28"/>
-          <w:szCs w:val="28"/>
-        </w:rPr>
-        <w:t>)</w:t>
-      </w:r>
-      <w:proofErr w:type="spellStart"/>
-      <w:r>
-        <w:rPr>
-          <w:b/>
-          <w:bCs/>
-          <w:color w:val="17365D" w:themeColor="text2" w:themeShade="BF"/>
-          <w:sz w:val="28"/>
-          <w:szCs w:val="28"/>
-        </w:rPr>
-        <w:t>Evidência</w:t>
-      </w:r>
-      <w:proofErr w:type="spellEnd"/>
-      <w:r>
-        <w:rPr>
-          <w:b/>
-          <w:bCs/>
-          <w:color w:val="17365D" w:themeColor="text2" w:themeShade="BF"/>
-          <w:sz w:val="28"/>
-          <w:szCs w:val="28"/>
-        </w:rPr>
-        <w:t xml:space="preserve"> </w:t>
-      </w:r>
-      <w:proofErr w:type="spellStart"/>
-      <w:r>
-        <w:rPr>
-          <w:b/>
-          <w:bCs/>
-          <w:color w:val="17365D" w:themeColor="text2" w:themeShade="BF"/>
-          <w:sz w:val="28"/>
-          <w:szCs w:val="28"/>
-        </w:rPr>
-        <w:t>Observacional</w:t>
-      </w:r>
-      <w:proofErr w:type="spellEnd"/>
-      <w:r>
-        <w:rPr>
-          <w:b/>
-          <w:bCs/>
-          <w:color w:val="17365D" w:themeColor="text2" w:themeShade="BF"/>
-          <w:sz w:val="28"/>
-          <w:szCs w:val="28"/>
-        </w:rPr>
-        <w:t xml:space="preserve"> de Redshifts </w:t>
-      </w:r>
-      <w:proofErr w:type="spellStart"/>
-      <w:r>
-        <w:rPr>
-          <w:b/>
-          <w:bCs/>
-          <w:color w:val="17365D" w:themeColor="text2" w:themeShade="BF"/>
-          <w:sz w:val="28"/>
-          <w:szCs w:val="28"/>
-        </w:rPr>
-        <w:t>Diferenciais</w:t>
-      </w:r>
-      <w:proofErr w:type="spellEnd"/>
-      <w:r>
-        <w:rPr>
-          <w:b/>
-          <w:bCs/>
-          <w:color w:val="17365D" w:themeColor="text2" w:themeShade="BF"/>
-          <w:sz w:val="28"/>
-          <w:szCs w:val="28"/>
-        </w:rPr>
-        <w:t xml:space="preserve"> </w:t>
-      </w:r>
-      <w:proofErr w:type="spellStart"/>
-      <w:r>
-        <w:rPr>
-          <w:b/>
-          <w:bCs/>
-          <w:color w:val="17365D" w:themeColor="text2" w:themeShade="BF"/>
-          <w:sz w:val="28"/>
-          <w:szCs w:val="28"/>
-        </w:rPr>
-        <w:t>Intrínsecos</w:t>
-      </w:r>
-      <w:proofErr w:type="spellEnd"/>
-      <w:r>
-        <w:rPr>
-          <w:b/>
-          <w:bCs/>
-          <w:color w:val="17365D" w:themeColor="text2" w:themeShade="BF"/>
-          <w:sz w:val="28"/>
-          <w:szCs w:val="28"/>
-        </w:rPr>
-        <w:t xml:space="preserve"> </w:t>
-      </w:r>
-      <w:proofErr w:type="spellStart"/>
-      <w:r>
-        <w:rPr>
-          <w:b/>
-          <w:bCs/>
-          <w:color w:val="17365D" w:themeColor="text2" w:themeShade="BF"/>
-          <w:sz w:val="28"/>
-          <w:szCs w:val="28"/>
-        </w:rPr>
-        <w:t>em</w:t>
-      </w:r>
-      <w:proofErr w:type="spellEnd"/>
-      <w:r>
-        <w:rPr>
-          <w:b/>
-          <w:bCs/>
-          <w:color w:val="17365D" w:themeColor="text2" w:themeShade="BF"/>
-          <w:sz w:val="28"/>
-          <w:szCs w:val="28"/>
-        </w:rPr>
-        <w:t xml:space="preserve"> Pares de </w:t>
-      </w:r>
-      <w:proofErr w:type="spellStart"/>
-      <w:r>
-        <w:rPr>
-          <w:b/>
-          <w:bCs/>
-          <w:color w:val="17365D" w:themeColor="text2" w:themeShade="BF"/>
-          <w:sz w:val="28"/>
-          <w:szCs w:val="28"/>
-        </w:rPr>
-        <w:t>Galáxias</w:t>
-      </w:r>
-      <w:proofErr w:type="spellEnd"/>
-      <w:r>
-        <w:rPr>
-          <w:b/>
-          <w:bCs/>
-          <w:color w:val="17365D" w:themeColor="text2" w:themeShade="BF"/>
-          <w:sz w:val="28"/>
-          <w:szCs w:val="28"/>
-        </w:rPr>
-        <w:t xml:space="preserve">: Um Teste da Teoria do Universo </w:t>
-      </w:r>
-      <w:proofErr w:type="spellStart"/>
-      <w:r>
-        <w:rPr>
-          <w:b/>
-          <w:bCs/>
-          <w:color w:val="17365D" w:themeColor="text2" w:themeShade="BF"/>
-          <w:sz w:val="28"/>
-          <w:szCs w:val="28"/>
-        </w:rPr>
-        <w:t>Decrescente</w:t>
-      </w:r>
-      <w:proofErr w:type="spellEnd"/>
-      <w:r>
-        <w:rPr>
-          <w:b/>
-          <w:bCs/>
-          <w:color w:val="17365D" w:themeColor="text2" w:themeShade="BF"/>
-          <w:sz w:val="28"/>
-          <w:szCs w:val="28"/>
-        </w:rPr>
-        <w:t xml:space="preserve"> (DUT)</w:t>
-      </w:r>
-    </w:p>
-    <w:p>
-      <w:pPr>
-        <w:pStyle w:val="Corpodetexto"/>
-      </w:pPr>
-      <w:r>
-        <w:t xml:space="preserve">“Neste </w:t>
-      </w:r>
-      <w:proofErr w:type="spellStart"/>
-      <w:r>
-        <w:t>trabalho</w:t>
-      </w:r>
-      <w:proofErr w:type="spellEnd"/>
-      <w:r>
-        <w:t xml:space="preserve">, </w:t>
-      </w:r>
-      <w:proofErr w:type="spellStart"/>
-      <w:r>
-        <w:t>analisamos</w:t>
-      </w:r>
-      <w:proofErr w:type="spellEnd"/>
-      <w:r>
-        <w:t xml:space="preserve"> </w:t>
-      </w:r>
-      <w:proofErr w:type="spellStart"/>
-      <w:r>
-        <w:t>uma</w:t>
-      </w:r>
-      <w:proofErr w:type="spellEnd"/>
-      <w:r>
-        <w:t xml:space="preserve"> </w:t>
-      </w:r>
-      <w:proofErr w:type="spellStart"/>
-      <w:r>
-        <w:t>amostra</w:t>
-      </w:r>
-      <w:proofErr w:type="spellEnd"/>
-      <w:r>
-        <w:t xml:space="preserve"> </w:t>
-      </w:r>
-      <w:proofErr w:type="spellStart"/>
-      <w:r>
-        <w:t>rigorosamente</w:t>
-      </w:r>
-      <w:proofErr w:type="spellEnd"/>
-      <w:r>
-        <w:t xml:space="preserve"> </w:t>
-      </w:r>
-      <w:proofErr w:type="spellStart"/>
-      <w:r>
-        <w:t>controlada</w:t>
-      </w:r>
-      <w:proofErr w:type="spellEnd"/>
-      <w:r>
-        <w:t xml:space="preserve"> de 𝑛 = 700 pares de </w:t>
-      </w:r>
-      <w:proofErr w:type="spellStart"/>
-      <w:r>
-        <w:t>galáxias</w:t>
-      </w:r>
-      <w:proofErr w:type="spellEnd"/>
-      <w:r>
-        <w:t xml:space="preserve"> </w:t>
-      </w:r>
-      <w:proofErr w:type="spellStart"/>
-      <w:r>
-        <w:t>em</w:t>
-      </w:r>
-      <w:proofErr w:type="spellEnd"/>
-      <w:r>
-        <w:t xml:space="preserve"> ambientes </w:t>
-      </w:r>
-      <w:proofErr w:type="spellStart"/>
-      <w:r>
-        <w:t>densos</w:t>
-      </w:r>
-      <w:proofErr w:type="spellEnd"/>
-      <w:r>
-        <w:t xml:space="preserve"> (</w:t>
-      </w:r>
-      <w:proofErr w:type="spellStart"/>
-      <w:r>
-        <w:t>incluindo</w:t>
-      </w:r>
-      <w:proofErr w:type="spellEnd"/>
-      <w:r>
-        <w:t xml:space="preserve"> </w:t>
-      </w:r>
-      <w:proofErr w:type="spellStart"/>
-      <w:r>
-        <w:t>os</w:t>
-      </w:r>
-      <w:proofErr w:type="spellEnd"/>
-      <w:r>
-        <w:t xml:space="preserve"> </w:t>
-      </w:r>
-      <w:proofErr w:type="spellStart"/>
-      <w:r>
-        <w:t>aglomerados</w:t>
-      </w:r>
-      <w:proofErr w:type="spellEnd"/>
-      <w:r>
-        <w:t xml:space="preserve"> de </w:t>
-      </w:r>
-      <w:proofErr w:type="spellStart"/>
-      <w:r>
-        <w:t>Virgem</w:t>
-      </w:r>
-      <w:proofErr w:type="spellEnd"/>
-      <w:r>
-        <w:t xml:space="preserve">, Fornax e </w:t>
-      </w:r>
-      <w:proofErr w:type="spellStart"/>
-      <w:r>
-        <w:t>Hidra</w:t>
-      </w:r>
-      <w:proofErr w:type="spellEnd"/>
-      <w:r>
-        <w:t xml:space="preserve">). </w:t>
-      </w:r>
-      <w:proofErr w:type="spellStart"/>
-      <w:r>
-        <w:t>Os</w:t>
-      </w:r>
-      <w:proofErr w:type="spellEnd"/>
-      <w:r>
-        <w:t xml:space="preserve"> dados </w:t>
-      </w:r>
-      <w:proofErr w:type="spellStart"/>
-      <w:r>
-        <w:t>revelam</w:t>
-      </w:r>
-      <w:proofErr w:type="spellEnd"/>
-      <w:r>
-        <w:t xml:space="preserve"> </w:t>
-      </w:r>
-      <w:proofErr w:type="spellStart"/>
-      <w:r>
-        <w:t>uma</w:t>
-      </w:r>
-      <w:proofErr w:type="spellEnd"/>
-      <w:r>
-        <w:t xml:space="preserve"> </w:t>
-      </w:r>
-      <w:proofErr w:type="spellStart"/>
-      <w:r>
-        <w:t>assimetria</w:t>
-      </w:r>
-      <w:proofErr w:type="spellEnd"/>
-      <w:r>
-        <w:t xml:space="preserve"> </w:t>
-      </w:r>
-      <w:proofErr w:type="spellStart"/>
-      <w:r>
-        <w:t>sistemática</w:t>
-      </w:r>
-      <w:proofErr w:type="spellEnd"/>
-      <w:r>
-        <w:t xml:space="preserve"> </w:t>
-      </w:r>
-      <w:proofErr w:type="spellStart"/>
-      <w:r>
-        <w:t>persistente</w:t>
-      </w:r>
-      <w:proofErr w:type="spellEnd"/>
-      <w:r>
-        <w:t xml:space="preserve">, </w:t>
-      </w:r>
-      <w:proofErr w:type="spellStart"/>
-      <w:r>
-        <w:t>na</w:t>
-      </w:r>
-      <w:proofErr w:type="spellEnd"/>
-      <w:r>
-        <w:t xml:space="preserve"> qual o </w:t>
-      </w:r>
-      <w:proofErr w:type="spellStart"/>
-      <w:r>
-        <w:t>componente</w:t>
-      </w:r>
-      <w:proofErr w:type="spellEnd"/>
-      <w:r>
-        <w:t xml:space="preserve"> </w:t>
-      </w:r>
-      <w:proofErr w:type="spellStart"/>
-      <w:r>
-        <w:t>primário</w:t>
-      </w:r>
-      <w:proofErr w:type="spellEnd"/>
-      <w:r>
-        <w:t xml:space="preserve"> </w:t>
-      </w:r>
-      <w:proofErr w:type="spellStart"/>
-      <w:r>
-        <w:t>mais</w:t>
-      </w:r>
-      <w:proofErr w:type="spellEnd"/>
-      <w:r>
-        <w:t xml:space="preserve"> </w:t>
-      </w:r>
-      <w:proofErr w:type="spellStart"/>
-      <w:r>
-        <w:t>massivo</w:t>
-      </w:r>
-      <w:proofErr w:type="spellEnd"/>
-      <w:r>
-        <w:t xml:space="preserve"> </w:t>
-      </w:r>
-      <w:proofErr w:type="spellStart"/>
-      <w:r>
-        <w:t>exibe</w:t>
-      </w:r>
-      <w:proofErr w:type="spellEnd"/>
-      <w:r>
-        <w:t xml:space="preserve"> um redshift </w:t>
-      </w:r>
-      <w:proofErr w:type="spellStart"/>
-      <w:r>
-        <w:t>menor</w:t>
-      </w:r>
-      <w:proofErr w:type="spellEnd"/>
-      <w:r>
-        <w:t xml:space="preserve"> do </w:t>
-      </w:r>
-      <w:proofErr w:type="spellStart"/>
-      <w:r>
-        <w:t>que</w:t>
-      </w:r>
-      <w:proofErr w:type="spellEnd"/>
-      <w:r>
-        <w:t xml:space="preserve"> </w:t>
-      </w:r>
-      <w:proofErr w:type="spellStart"/>
-      <w:r>
-        <w:t>o</w:t>
-      </w:r>
-      <w:proofErr w:type="spellEnd"/>
-      <w:r>
-        <w:t xml:space="preserve"> </w:t>
-      </w:r>
-      <w:proofErr w:type="spellStart"/>
-      <w:r>
-        <w:t>previsto</w:t>
-      </w:r>
-      <w:proofErr w:type="spellEnd"/>
-      <w:r>
-        <w:t xml:space="preserve"> </w:t>
-      </w:r>
-      <w:proofErr w:type="spellStart"/>
-      <w:r>
-        <w:t>em</w:t>
-      </w:r>
-      <w:proofErr w:type="spellEnd"/>
-      <w:r>
-        <w:t xml:space="preserve"> 56,28% dos </w:t>
-      </w:r>
-      <w:proofErr w:type="spellStart"/>
-      <w:r>
-        <w:t>casos</w:t>
-      </w:r>
-      <w:proofErr w:type="spellEnd"/>
-      <w:r>
-        <w:t xml:space="preserve">. O teste </w:t>
-      </w:r>
-      <w:proofErr w:type="spellStart"/>
-      <w:r>
-        <w:t>estatístico</w:t>
-      </w:r>
-      <w:proofErr w:type="spellEnd"/>
-      <w:r>
-        <w:t xml:space="preserve"> de </w:t>
-      </w:r>
-      <w:proofErr w:type="spellStart"/>
-      <w:r>
-        <w:t>hipótese</w:t>
-      </w:r>
-      <w:proofErr w:type="spellEnd"/>
-      <w:r>
-        <w:t xml:space="preserve"> </w:t>
-      </w:r>
-      <w:proofErr w:type="spellStart"/>
-      <w:r>
-        <w:t>rejeita</w:t>
-      </w:r>
-      <w:proofErr w:type="spellEnd"/>
-      <w:r>
-        <w:t xml:space="preserve"> a </w:t>
-      </w:r>
-      <w:proofErr w:type="spellStart"/>
-      <w:r>
-        <w:t>simetria</w:t>
-      </w:r>
-      <w:proofErr w:type="spellEnd"/>
-      <w:r>
-        <w:t xml:space="preserve"> </w:t>
-      </w:r>
-      <w:proofErr w:type="spellStart"/>
-      <w:r>
-        <w:t>aleatória</w:t>
-      </w:r>
-      <w:proofErr w:type="spellEnd"/>
-      <w:r>
-        <w:t xml:space="preserve"> com um Z-score de 3,33 e um valor-p de 0,00043 (</w:t>
-      </w:r>
-      <w:proofErr w:type="spellStart"/>
-      <w:r>
-        <w:rPr>
-          <w:b/>
-          <w:bCs/>
-        </w:rPr>
-        <w:t>nível</w:t>
-      </w:r>
-      <w:proofErr w:type="spellEnd"/>
-      <w:r>
-        <w:rPr>
-          <w:b/>
-          <w:bCs/>
-        </w:rPr>
-        <w:t xml:space="preserve"> de </w:t>
-      </w:r>
-      <w:proofErr w:type="spellStart"/>
-      <w:r>
-        <w:rPr>
-          <w:b/>
-          <w:bCs/>
-        </w:rPr>
-        <w:t>confiança</w:t>
-      </w:r>
-      <w:proofErr w:type="spellEnd"/>
-      <w:r>
-        <w:rPr>
-          <w:b/>
-          <w:bCs/>
-        </w:rPr>
-        <w:t xml:space="preserve"> de 99,957%</w:t>
-      </w:r>
-      <w:r>
-        <w:t>).” (</w:t>
-      </w:r>
-      <w:r>
-        <w:rPr>
-          <w:color w:val="EE0000"/>
-        </w:rPr>
-        <w:t>Jun/2026</w:t>
-      </w:r>
-      <w:r>
-        <w:t>)</w:t>
-      </w:r>
+      <w:hyperlink r:id="rId30" w:history="1">
+        <w:r>
+          <w:rPr>
+            <w:rStyle w:val="Hyperlink"/>
+          </w:rPr>
+          <w:t>https://jocaxx.github.io/DUniverse/Html/POR_DUT_NGC1052.htm</w:t>
+        </w:r>
+      </w:hyperlink>
     </w:p>
     <w:p>
       <w:pPr>
@@ -4006,7 +3499,562 @@
           <w:bottom w:val="single" w:sz="6" w:space="1" w:color="auto"/>
         </w:pBdr>
       </w:pPr>
-      <w:hyperlink r:id="rId28" w:history="1">
+    </w:p>
+    <w:p>
+      <w:pPr>
+        <w:pStyle w:val="Corpodetexto"/>
+      </w:pPr>
+    </w:p>
+    <w:p>
+      <w:pPr>
+        <w:pStyle w:val="Corpodetexto"/>
+        <w:rPr>
+          <w:color w:val="17365D" w:themeColor="text2" w:themeShade="BF"/>
+          <w:sz w:val="28"/>
+          <w:szCs w:val="28"/>
+        </w:rPr>
+      </w:pPr>
+      <w:r>
+        <w:rPr>
+          <w:b/>
+          <w:bCs/>
+          <w:color w:val="17365D" w:themeColor="text2" w:themeShade="BF"/>
+          <w:sz w:val="28"/>
+          <w:szCs w:val="28"/>
+        </w:rPr>
+        <w:t>(</w:t>
+      </w:r>
+      <w:r>
+        <w:rPr>
+          <w:b/>
+          <w:bCs/>
+          <w:color w:val="EE0000"/>
+          <w:sz w:val="28"/>
+          <w:szCs w:val="28"/>
+        </w:rPr>
+        <w:t>*</w:t>
+      </w:r>
+      <w:r>
+        <w:rPr>
+          <w:b/>
+          <w:bCs/>
+          <w:color w:val="17365D" w:themeColor="text2" w:themeShade="BF"/>
+          <w:sz w:val="28"/>
+          <w:szCs w:val="28"/>
+        </w:rPr>
+        <w:t>)</w:t>
+      </w:r>
+      <w:proofErr w:type="spellStart"/>
+      <w:r>
+        <w:rPr>
+          <w:b/>
+          <w:bCs/>
+          <w:color w:val="17365D" w:themeColor="text2" w:themeShade="BF"/>
+          <w:sz w:val="28"/>
+          <w:szCs w:val="28"/>
+        </w:rPr>
+        <w:t>Evidência</w:t>
+      </w:r>
+      <w:proofErr w:type="spellEnd"/>
+      <w:r>
+        <w:rPr>
+          <w:b/>
+          <w:bCs/>
+          <w:color w:val="17365D" w:themeColor="text2" w:themeShade="BF"/>
+          <w:sz w:val="28"/>
+          <w:szCs w:val="28"/>
+        </w:rPr>
+        <w:t xml:space="preserve"> </w:t>
+      </w:r>
+      <w:proofErr w:type="spellStart"/>
+      <w:r>
+        <w:rPr>
+          <w:b/>
+          <w:bCs/>
+          <w:color w:val="17365D" w:themeColor="text2" w:themeShade="BF"/>
+          <w:sz w:val="28"/>
+          <w:szCs w:val="28"/>
+        </w:rPr>
+        <w:t>Observacional</w:t>
+      </w:r>
+      <w:proofErr w:type="spellEnd"/>
+      <w:r>
+        <w:rPr>
+          <w:b/>
+          <w:bCs/>
+          <w:color w:val="17365D" w:themeColor="text2" w:themeShade="BF"/>
+          <w:sz w:val="28"/>
+          <w:szCs w:val="28"/>
+        </w:rPr>
+        <w:t xml:space="preserve"> de Redshifts </w:t>
+      </w:r>
+      <w:proofErr w:type="spellStart"/>
+      <w:r>
+        <w:rPr>
+          <w:b/>
+          <w:bCs/>
+          <w:color w:val="17365D" w:themeColor="text2" w:themeShade="BF"/>
+          <w:sz w:val="28"/>
+          <w:szCs w:val="28"/>
+        </w:rPr>
+        <w:t>Diferenciais</w:t>
+      </w:r>
+      <w:proofErr w:type="spellEnd"/>
+      <w:r>
+        <w:rPr>
+          <w:b/>
+          <w:bCs/>
+          <w:color w:val="17365D" w:themeColor="text2" w:themeShade="BF"/>
+          <w:sz w:val="28"/>
+          <w:szCs w:val="28"/>
+        </w:rPr>
+        <w:t xml:space="preserve"> </w:t>
+      </w:r>
+      <w:proofErr w:type="spellStart"/>
+      <w:r>
+        <w:rPr>
+          <w:b/>
+          <w:bCs/>
+          <w:color w:val="17365D" w:themeColor="text2" w:themeShade="BF"/>
+          <w:sz w:val="28"/>
+          <w:szCs w:val="28"/>
+        </w:rPr>
+        <w:t>Intrínsecos</w:t>
+      </w:r>
+      <w:proofErr w:type="spellEnd"/>
+      <w:r>
+        <w:rPr>
+          <w:b/>
+          <w:bCs/>
+          <w:color w:val="17365D" w:themeColor="text2" w:themeShade="BF"/>
+          <w:sz w:val="28"/>
+          <w:szCs w:val="28"/>
+        </w:rPr>
+        <w:t xml:space="preserve"> </w:t>
+      </w:r>
+      <w:proofErr w:type="spellStart"/>
+      <w:r>
+        <w:rPr>
+          <w:b/>
+          <w:bCs/>
+          <w:color w:val="17365D" w:themeColor="text2" w:themeShade="BF"/>
+          <w:sz w:val="28"/>
+          <w:szCs w:val="28"/>
+        </w:rPr>
+        <w:t>em</w:t>
+      </w:r>
+      <w:proofErr w:type="spellEnd"/>
+      <w:r>
+        <w:rPr>
+          <w:b/>
+          <w:bCs/>
+          <w:color w:val="17365D" w:themeColor="text2" w:themeShade="BF"/>
+          <w:sz w:val="28"/>
+          <w:szCs w:val="28"/>
+        </w:rPr>
+        <w:t xml:space="preserve"> Pares de </w:t>
+      </w:r>
+      <w:proofErr w:type="spellStart"/>
+      <w:r>
+        <w:rPr>
+          <w:b/>
+          <w:bCs/>
+          <w:color w:val="17365D" w:themeColor="text2" w:themeShade="BF"/>
+          <w:sz w:val="28"/>
+          <w:szCs w:val="28"/>
+        </w:rPr>
+        <w:t>Galáxias</w:t>
+      </w:r>
+      <w:proofErr w:type="spellEnd"/>
+      <w:r>
+        <w:rPr>
+          <w:b/>
+          <w:bCs/>
+          <w:color w:val="17365D" w:themeColor="text2" w:themeShade="BF"/>
+          <w:sz w:val="28"/>
+          <w:szCs w:val="28"/>
+        </w:rPr>
+        <w:t xml:space="preserve">: Um Teste da Teoria do Universo </w:t>
+      </w:r>
+      <w:proofErr w:type="spellStart"/>
+      <w:r>
+        <w:rPr>
+          <w:b/>
+          <w:bCs/>
+          <w:color w:val="17365D" w:themeColor="text2" w:themeShade="BF"/>
+          <w:sz w:val="28"/>
+          <w:szCs w:val="28"/>
+        </w:rPr>
+        <w:t>Decrescente</w:t>
+      </w:r>
+      <w:proofErr w:type="spellEnd"/>
+      <w:r>
+        <w:rPr>
+          <w:b/>
+          <w:bCs/>
+          <w:color w:val="17365D" w:themeColor="text2" w:themeShade="BF"/>
+          <w:sz w:val="28"/>
+          <w:szCs w:val="28"/>
+        </w:rPr>
+        <w:t xml:space="preserve"> (DUT)</w:t>
+      </w:r>
+    </w:p>
+    <w:p>
+      <w:pPr>
+        <w:pStyle w:val="Corpodetexto"/>
+      </w:pPr>
+      <w:r>
+        <w:t xml:space="preserve">“Neste </w:t>
+      </w:r>
+      <w:proofErr w:type="spellStart"/>
+      <w:r>
+        <w:t>trabalho</w:t>
+      </w:r>
+      <w:proofErr w:type="spellEnd"/>
+      <w:r>
+        <w:t xml:space="preserve">, </w:t>
+      </w:r>
+      <w:proofErr w:type="spellStart"/>
+      <w:r>
+        <w:t>analisamos</w:t>
+      </w:r>
+      <w:proofErr w:type="spellEnd"/>
+      <w:r>
+        <w:t xml:space="preserve"> </w:t>
+      </w:r>
+      <w:proofErr w:type="spellStart"/>
+      <w:r>
+        <w:t>uma</w:t>
+      </w:r>
+      <w:proofErr w:type="spellEnd"/>
+      <w:r>
+        <w:t xml:space="preserve"> </w:t>
+      </w:r>
+      <w:proofErr w:type="spellStart"/>
+      <w:r>
+        <w:t>amostra</w:t>
+      </w:r>
+      <w:proofErr w:type="spellEnd"/>
+      <w:r>
+        <w:t xml:space="preserve"> </w:t>
+      </w:r>
+      <w:proofErr w:type="spellStart"/>
+      <w:r>
+        <w:t>rigorosamente</w:t>
+      </w:r>
+      <w:proofErr w:type="spellEnd"/>
+      <w:r>
+        <w:t xml:space="preserve"> </w:t>
+      </w:r>
+      <w:proofErr w:type="spellStart"/>
+      <w:r>
+        <w:t>controlada</w:t>
+      </w:r>
+      <w:proofErr w:type="spellEnd"/>
+      <w:r>
+        <w:t xml:space="preserve"> de 𝑛 = 700 pares de </w:t>
+      </w:r>
+      <w:proofErr w:type="spellStart"/>
+      <w:r>
+        <w:t>galáxias</w:t>
+      </w:r>
+      <w:proofErr w:type="spellEnd"/>
+      <w:r>
+        <w:t xml:space="preserve"> </w:t>
+      </w:r>
+      <w:proofErr w:type="spellStart"/>
+      <w:r>
+        <w:t>em</w:t>
+      </w:r>
+      <w:proofErr w:type="spellEnd"/>
+      <w:r>
+        <w:t xml:space="preserve"> ambientes </w:t>
+      </w:r>
+      <w:proofErr w:type="spellStart"/>
+      <w:r>
+        <w:t>densos</w:t>
+      </w:r>
+      <w:proofErr w:type="spellEnd"/>
+      <w:r>
+        <w:t xml:space="preserve"> (</w:t>
+      </w:r>
+      <w:proofErr w:type="spellStart"/>
+      <w:r>
+        <w:t>incluindo</w:t>
+      </w:r>
+      <w:proofErr w:type="spellEnd"/>
+      <w:r>
+        <w:t xml:space="preserve"> </w:t>
+      </w:r>
+      <w:proofErr w:type="spellStart"/>
+      <w:r>
+        <w:t>os</w:t>
+      </w:r>
+      <w:proofErr w:type="spellEnd"/>
+      <w:r>
+        <w:t xml:space="preserve"> </w:t>
+      </w:r>
+      <w:proofErr w:type="spellStart"/>
+      <w:r>
+        <w:t>aglomerados</w:t>
+      </w:r>
+      <w:proofErr w:type="spellEnd"/>
+      <w:r>
+        <w:t xml:space="preserve"> de </w:t>
+      </w:r>
+      <w:proofErr w:type="spellStart"/>
+      <w:r>
+        <w:t>Virgem</w:t>
+      </w:r>
+      <w:proofErr w:type="spellEnd"/>
+      <w:r>
+        <w:t xml:space="preserve">, Fornax e </w:t>
+      </w:r>
+      <w:proofErr w:type="spellStart"/>
+      <w:r>
+        <w:t>Hidra</w:t>
+      </w:r>
+      <w:proofErr w:type="spellEnd"/>
+      <w:r>
+        <w:t xml:space="preserve">). </w:t>
+      </w:r>
+      <w:proofErr w:type="spellStart"/>
+      <w:r>
+        <w:t>Os</w:t>
+      </w:r>
+      <w:proofErr w:type="spellEnd"/>
+      <w:r>
+        <w:t xml:space="preserve"> dados </w:t>
+      </w:r>
+      <w:proofErr w:type="spellStart"/>
+      <w:r>
+        <w:t>revelam</w:t>
+      </w:r>
+      <w:proofErr w:type="spellEnd"/>
+      <w:r>
+        <w:t xml:space="preserve"> </w:t>
+      </w:r>
+      <w:proofErr w:type="spellStart"/>
+      <w:r>
+        <w:t>uma</w:t>
+      </w:r>
+      <w:proofErr w:type="spellEnd"/>
+      <w:r>
+        <w:t xml:space="preserve"> </w:t>
+      </w:r>
+      <w:proofErr w:type="spellStart"/>
+      <w:r>
+        <w:t>assimetria</w:t>
+      </w:r>
+      <w:proofErr w:type="spellEnd"/>
+      <w:r>
+        <w:t xml:space="preserve"> </w:t>
+      </w:r>
+      <w:proofErr w:type="spellStart"/>
+      <w:r>
+        <w:t>sistemática</w:t>
+      </w:r>
+      <w:proofErr w:type="spellEnd"/>
+      <w:r>
+        <w:t xml:space="preserve"> </w:t>
+      </w:r>
+      <w:proofErr w:type="spellStart"/>
+      <w:r>
+        <w:t>persistente</w:t>
+      </w:r>
+      <w:proofErr w:type="spellEnd"/>
+      <w:r>
+        <w:t xml:space="preserve">, </w:t>
+      </w:r>
+      <w:proofErr w:type="spellStart"/>
+      <w:r>
+        <w:t>na</w:t>
+      </w:r>
+      <w:proofErr w:type="spellEnd"/>
+      <w:r>
+        <w:t xml:space="preserve"> qual o </w:t>
+      </w:r>
+      <w:proofErr w:type="spellStart"/>
+      <w:r>
+        <w:t>componente</w:t>
+      </w:r>
+      <w:proofErr w:type="spellEnd"/>
+      <w:r>
+        <w:t xml:space="preserve"> </w:t>
+      </w:r>
+      <w:proofErr w:type="spellStart"/>
+      <w:r>
+        <w:t>primário</w:t>
+      </w:r>
+      <w:proofErr w:type="spellEnd"/>
+      <w:r>
+        <w:t xml:space="preserve"> </w:t>
+      </w:r>
+      <w:proofErr w:type="spellStart"/>
+      <w:r>
+        <w:t>mais</w:t>
+      </w:r>
+      <w:proofErr w:type="spellEnd"/>
+      <w:r>
+        <w:t xml:space="preserve"> </w:t>
+      </w:r>
+      <w:proofErr w:type="spellStart"/>
+      <w:r>
+        <w:t>massivo</w:t>
+      </w:r>
+      <w:proofErr w:type="spellEnd"/>
+      <w:r>
+        <w:t xml:space="preserve"> </w:t>
+      </w:r>
+      <w:proofErr w:type="spellStart"/>
+      <w:r>
+        <w:t>exibe</w:t>
+      </w:r>
+      <w:proofErr w:type="spellEnd"/>
+      <w:r>
+        <w:t xml:space="preserve"> um redshift </w:t>
+      </w:r>
+      <w:proofErr w:type="spellStart"/>
+      <w:r>
+        <w:t>menor</w:t>
+      </w:r>
+      <w:proofErr w:type="spellEnd"/>
+      <w:r>
+        <w:t xml:space="preserve"> do </w:t>
+      </w:r>
+      <w:proofErr w:type="spellStart"/>
+      <w:r>
+        <w:t>que</w:t>
+      </w:r>
+      <w:proofErr w:type="spellEnd"/>
+      <w:r>
+        <w:t xml:space="preserve"> </w:t>
+      </w:r>
+      <w:proofErr w:type="spellStart"/>
+      <w:r>
+        <w:t>o</w:t>
+      </w:r>
+      <w:proofErr w:type="spellEnd"/>
+      <w:r>
+        <w:t xml:space="preserve"> </w:t>
+      </w:r>
+      <w:proofErr w:type="spellStart"/>
+      <w:r>
+        <w:t>previsto</w:t>
+      </w:r>
+      <w:proofErr w:type="spellEnd"/>
+      <w:r>
+        <w:t xml:space="preserve"> </w:t>
+      </w:r>
+      <w:proofErr w:type="spellStart"/>
+      <w:r>
+        <w:t>em</w:t>
+      </w:r>
+      <w:proofErr w:type="spellEnd"/>
+      <w:r>
+        <w:t xml:space="preserve"> 56,28% dos </w:t>
+      </w:r>
+      <w:proofErr w:type="spellStart"/>
+      <w:r>
+        <w:t>casos</w:t>
+      </w:r>
+      <w:proofErr w:type="spellEnd"/>
+      <w:r>
+        <w:t xml:space="preserve">. O teste </w:t>
+      </w:r>
+      <w:proofErr w:type="spellStart"/>
+      <w:r>
+        <w:t>estatístico</w:t>
+      </w:r>
+      <w:proofErr w:type="spellEnd"/>
+      <w:r>
+        <w:t xml:space="preserve"> de </w:t>
+      </w:r>
+      <w:proofErr w:type="spellStart"/>
+      <w:r>
+        <w:t>hipótese</w:t>
+      </w:r>
+      <w:proofErr w:type="spellEnd"/>
+      <w:r>
+        <w:t xml:space="preserve"> </w:t>
+      </w:r>
+      <w:proofErr w:type="spellStart"/>
+      <w:r>
+        <w:t>rejeita</w:t>
+      </w:r>
+      <w:proofErr w:type="spellEnd"/>
+      <w:r>
+        <w:t xml:space="preserve"> a </w:t>
+      </w:r>
+      <w:proofErr w:type="spellStart"/>
+      <w:r>
+        <w:t>simetria</w:t>
+      </w:r>
+      <w:proofErr w:type="spellEnd"/>
+      <w:r>
+        <w:t xml:space="preserve"> </w:t>
+      </w:r>
+      <w:proofErr w:type="spellStart"/>
+      <w:r>
+        <w:t>aleatória</w:t>
+      </w:r>
+      <w:proofErr w:type="spellEnd"/>
+      <w:r>
+        <w:t xml:space="preserve"> com um Z-score de 3,33 e um valor-p de 0,00043 (</w:t>
+      </w:r>
+      <w:proofErr w:type="spellStart"/>
+      <w:r>
+        <w:rPr>
+          <w:b/>
+          <w:bCs/>
+        </w:rPr>
+        <w:t>nível</w:t>
+      </w:r>
+      <w:proofErr w:type="spellEnd"/>
+      <w:r>
+        <w:rPr>
+          <w:b/>
+          <w:bCs/>
+        </w:rPr>
+        <w:t xml:space="preserve"> de </w:t>
+      </w:r>
+      <w:proofErr w:type="spellStart"/>
+      <w:r>
+        <w:rPr>
+          <w:b/>
+          <w:bCs/>
+        </w:rPr>
+        <w:t>confiança</w:t>
+      </w:r>
+      <w:proofErr w:type="spellEnd"/>
+      <w:r>
+        <w:rPr>
+          <w:b/>
+          <w:bCs/>
+        </w:rPr>
+        <w:t xml:space="preserve"> de 99,957%</w:t>
+      </w:r>
+      <w:r>
+        <w:t>).” (</w:t>
+      </w:r>
+      <w:r>
+        <w:rPr>
+          <w:color w:val="EE0000"/>
+        </w:rPr>
+        <w:t>Jun/2026</w:t>
+      </w:r>
+      <w:r>
+        <w:t>)</w:t>
+      </w:r>
+    </w:p>
+    <w:p>
+      <w:pPr>
+        <w:pStyle w:val="Corpodetexto"/>
+        <w:pBdr>
+          <w:bottom w:val="single" w:sz="6" w:space="1" w:color="auto"/>
+        </w:pBdr>
+      </w:pPr>
+      <w:hyperlink r:id="rId31" w:history="1">
         <w:r>
           <w:rPr>
             <w:rStyle w:val="Hyperlink"/>
@@ -4022,380 +4070,14 @@
           <w:bottom w:val="single" w:sz="6" w:space="1" w:color="auto"/>
         </w:pBdr>
       </w:pPr>
-    </w:p>
-    <w:p>
-      <w:pPr>
-        <w:pStyle w:val="Corpodetexto"/>
-      </w:pPr>
-    </w:p>
-    <w:p>
-      <w:pPr>
-        <w:pStyle w:val="Corpodetexto"/>
-        <w:rPr>
-          <w:color w:val="17365D" w:themeColor="text2" w:themeShade="BF"/>
-          <w:sz w:val="28"/>
-          <w:szCs w:val="28"/>
-        </w:rPr>
-      </w:pPr>
-      <w:r>
-        <w:rPr>
-          <w:b/>
-          <w:bCs/>
-          <w:color w:val="17365D" w:themeColor="text2" w:themeShade="BF"/>
-          <w:sz w:val="28"/>
-          <w:szCs w:val="28"/>
-        </w:rPr>
-        <w:t>(</w:t>
-      </w:r>
-      <w:r>
-        <w:rPr>
-          <w:b/>
-          <w:bCs/>
-          <w:color w:val="EE0000"/>
-          <w:sz w:val="28"/>
-          <w:szCs w:val="28"/>
-        </w:rPr>
-        <w:t>*</w:t>
-      </w:r>
-      <w:r>
-        <w:rPr>
-          <w:b/>
-          <w:bCs/>
-          <w:color w:val="17365D" w:themeColor="text2" w:themeShade="BF"/>
-          <w:sz w:val="28"/>
-          <w:szCs w:val="28"/>
-        </w:rPr>
-        <w:t xml:space="preserve">)Teoria do Universo </w:t>
-      </w:r>
-      <w:proofErr w:type="spellStart"/>
-      <w:r>
-        <w:rPr>
-          <w:b/>
-          <w:bCs/>
-          <w:color w:val="17365D" w:themeColor="text2" w:themeShade="BF"/>
-          <w:sz w:val="28"/>
-          <w:szCs w:val="28"/>
-        </w:rPr>
-        <w:t>Decrescente</w:t>
-      </w:r>
-      <w:proofErr w:type="spellEnd"/>
-      <w:r>
-        <w:rPr>
-          <w:b/>
-          <w:bCs/>
-          <w:color w:val="17365D" w:themeColor="text2" w:themeShade="BF"/>
-          <w:sz w:val="28"/>
-          <w:szCs w:val="28"/>
-        </w:rPr>
-        <w:t xml:space="preserve">: </w:t>
-      </w:r>
-      <w:proofErr w:type="spellStart"/>
-      <w:r>
-        <w:rPr>
-          <w:b/>
-          <w:bCs/>
-          <w:color w:val="17365D" w:themeColor="text2" w:themeShade="BF"/>
-          <w:sz w:val="28"/>
-          <w:szCs w:val="28"/>
-        </w:rPr>
-        <w:t>Dilatação</w:t>
-      </w:r>
-      <w:proofErr w:type="spellEnd"/>
-      <w:r>
-        <w:rPr>
-          <w:b/>
-          <w:bCs/>
-          <w:color w:val="17365D" w:themeColor="text2" w:themeShade="BF"/>
-          <w:sz w:val="28"/>
-          <w:szCs w:val="28"/>
-        </w:rPr>
-        <w:t xml:space="preserve"> Temporal </w:t>
-      </w:r>
-      <w:proofErr w:type="spellStart"/>
-      <w:r>
-        <w:rPr>
-          <w:b/>
-          <w:bCs/>
-          <w:color w:val="17365D" w:themeColor="text2" w:themeShade="BF"/>
-          <w:sz w:val="28"/>
-          <w:szCs w:val="28"/>
-        </w:rPr>
-        <w:t>Cosmológica</w:t>
-      </w:r>
-      <w:proofErr w:type="spellEnd"/>
-      <w:r>
-        <w:rPr>
-          <w:b/>
-          <w:bCs/>
-          <w:color w:val="17365D" w:themeColor="text2" w:themeShade="BF"/>
-          <w:sz w:val="28"/>
-          <w:szCs w:val="28"/>
-        </w:rPr>
-        <w:t xml:space="preserve"> e a </w:t>
-      </w:r>
-      <w:proofErr w:type="spellStart"/>
-      <w:r>
-        <w:rPr>
-          <w:b/>
-          <w:bCs/>
-          <w:color w:val="17365D" w:themeColor="text2" w:themeShade="BF"/>
-          <w:sz w:val="28"/>
-          <w:szCs w:val="28"/>
-        </w:rPr>
-        <w:t>Explosão</w:t>
-      </w:r>
-      <w:proofErr w:type="spellEnd"/>
-      <w:r>
-        <w:rPr>
-          <w:b/>
-          <w:bCs/>
-          <w:color w:val="17365D" w:themeColor="text2" w:themeShade="BF"/>
-          <w:sz w:val="28"/>
-          <w:szCs w:val="28"/>
-        </w:rPr>
-        <w:t xml:space="preserve"> de SN1A</w:t>
-      </w:r>
-    </w:p>
-    <w:p>
-      <w:pPr>
-        <w:pStyle w:val="Corpodetexto"/>
-      </w:pPr>
-      <w:r>
-        <w:t>“</w:t>
-      </w:r>
-      <w:proofErr w:type="spellStart"/>
-      <w:r>
-        <w:t>Mostraremos</w:t>
-      </w:r>
-      <w:proofErr w:type="spellEnd"/>
-      <w:r>
-        <w:t xml:space="preserve"> </w:t>
-      </w:r>
-      <w:proofErr w:type="spellStart"/>
-      <w:r>
-        <w:t>que</w:t>
-      </w:r>
-      <w:proofErr w:type="spellEnd"/>
-      <w:r>
-        <w:t xml:space="preserve">, </w:t>
-      </w:r>
-      <w:proofErr w:type="spellStart"/>
-      <w:r>
-        <w:t>dentro</w:t>
-      </w:r>
-      <w:proofErr w:type="spellEnd"/>
-      <w:r>
-        <w:t xml:space="preserve"> </w:t>
-      </w:r>
-      <w:proofErr w:type="spellStart"/>
-      <w:r>
-        <w:t>da”Teoria</w:t>
-      </w:r>
-      <w:proofErr w:type="spellEnd"/>
-      <w:r>
-        <w:t xml:space="preserve"> do Universo </w:t>
-      </w:r>
-      <w:proofErr w:type="spellStart"/>
-      <w:r>
-        <w:t>Decrescente</w:t>
-      </w:r>
-      <w:proofErr w:type="spellEnd"/>
-      <w:r>
-        <w:t xml:space="preserve">” (DUT), o tempo </w:t>
-      </w:r>
-      <w:proofErr w:type="spellStart"/>
-      <w:r>
-        <w:t>dentro</w:t>
-      </w:r>
-      <w:proofErr w:type="spellEnd"/>
-      <w:r>
-        <w:t xml:space="preserve"> de um campo </w:t>
-      </w:r>
-      <w:proofErr w:type="spellStart"/>
-      <w:r>
-        <w:t>gravitacional</w:t>
-      </w:r>
-      <w:proofErr w:type="spellEnd"/>
-      <w:r>
-        <w:t xml:space="preserve"> é </w:t>
-      </w:r>
-      <w:proofErr w:type="spellStart"/>
-      <w:r>
-        <w:t>alterado</w:t>
-      </w:r>
-      <w:proofErr w:type="spellEnd"/>
-      <w:r>
-        <w:t xml:space="preserve"> da </w:t>
-      </w:r>
-      <w:proofErr w:type="spellStart"/>
-      <w:r>
-        <w:t>mesma</w:t>
-      </w:r>
-      <w:proofErr w:type="spellEnd"/>
-      <w:r>
-        <w:t xml:space="preserve"> forma </w:t>
-      </w:r>
-      <w:proofErr w:type="spellStart"/>
-      <w:r>
-        <w:t>que</w:t>
-      </w:r>
-      <w:proofErr w:type="spellEnd"/>
-      <w:r>
-        <w:t xml:space="preserve"> as </w:t>
-      </w:r>
-      <w:proofErr w:type="spellStart"/>
-      <w:r>
-        <w:t>escalas</w:t>
-      </w:r>
-      <w:proofErr w:type="spellEnd"/>
-      <w:r>
-        <w:t xml:space="preserve"> de </w:t>
-      </w:r>
-      <w:proofErr w:type="spellStart"/>
-      <w:r>
-        <w:t>medição</w:t>
-      </w:r>
-      <w:proofErr w:type="spellEnd"/>
-      <w:r>
-        <w:t xml:space="preserve"> de </w:t>
-      </w:r>
-      <w:proofErr w:type="spellStart"/>
-      <w:r>
-        <w:t>distância</w:t>
-      </w:r>
-      <w:proofErr w:type="spellEnd"/>
-      <w:r>
-        <w:t xml:space="preserve"> </w:t>
-      </w:r>
-      <w:proofErr w:type="spellStart"/>
-      <w:r>
-        <w:t>espacial</w:t>
-      </w:r>
-      <w:proofErr w:type="spellEnd"/>
-      <w:r>
-        <w:t xml:space="preserve">. Em </w:t>
-      </w:r>
-      <w:proofErr w:type="spellStart"/>
-      <w:r>
-        <w:t>escala</w:t>
-      </w:r>
-      <w:proofErr w:type="spellEnd"/>
-      <w:r>
-        <w:t xml:space="preserve"> </w:t>
-      </w:r>
-      <w:proofErr w:type="spellStart"/>
-      <w:r>
-        <w:t>cósmica</w:t>
-      </w:r>
-      <w:proofErr w:type="spellEnd"/>
-      <w:r>
-        <w:t xml:space="preserve"> (</w:t>
-      </w:r>
-      <w:proofErr w:type="spellStart"/>
-      <w:r>
-        <w:t>períodos</w:t>
-      </w:r>
-      <w:proofErr w:type="spellEnd"/>
-      <w:r>
-        <w:t xml:space="preserve"> de </w:t>
-      </w:r>
-      <w:proofErr w:type="spellStart"/>
-      <w:r>
-        <w:t>milhões</w:t>
-      </w:r>
-      <w:proofErr w:type="spellEnd"/>
-      <w:r>
-        <w:t xml:space="preserve"> de </w:t>
-      </w:r>
-      <w:proofErr w:type="spellStart"/>
-      <w:r>
-        <w:t>anos</w:t>
-      </w:r>
-      <w:proofErr w:type="spellEnd"/>
-      <w:r>
-        <w:t xml:space="preserve">), esse </w:t>
-      </w:r>
-      <w:proofErr w:type="spellStart"/>
-      <w:r>
-        <w:t>efeito</w:t>
-      </w:r>
-      <w:proofErr w:type="spellEnd"/>
-      <w:r>
-        <w:t xml:space="preserve"> </w:t>
-      </w:r>
-      <w:proofErr w:type="spellStart"/>
-      <w:r>
-        <w:t>torna</w:t>
-      </w:r>
-      <w:proofErr w:type="spellEnd"/>
-      <w:r>
-        <w:t xml:space="preserve">-se </w:t>
-      </w:r>
-      <w:proofErr w:type="spellStart"/>
-      <w:r>
-        <w:t>perceptível</w:t>
-      </w:r>
-      <w:proofErr w:type="spellEnd"/>
-      <w:r>
-        <w:t xml:space="preserve"> e </w:t>
-      </w:r>
-      <w:proofErr w:type="spellStart"/>
-      <w:r>
-        <w:t>explica</w:t>
-      </w:r>
-      <w:proofErr w:type="spellEnd"/>
-      <w:r>
-        <w:t xml:space="preserve"> a </w:t>
-      </w:r>
-      <w:proofErr w:type="spellStart"/>
-      <w:r>
-        <w:t>variação</w:t>
-      </w:r>
-      <w:proofErr w:type="spellEnd"/>
-      <w:r>
-        <w:t xml:space="preserve"> </w:t>
-      </w:r>
-      <w:proofErr w:type="spellStart"/>
-      <w:r>
-        <w:t>na</w:t>
-      </w:r>
-      <w:proofErr w:type="spellEnd"/>
-      <w:r>
-        <w:t xml:space="preserve"> </w:t>
-      </w:r>
-      <w:proofErr w:type="spellStart"/>
-      <w:r>
-        <w:t>duração</w:t>
-      </w:r>
-      <w:proofErr w:type="spellEnd"/>
-      <w:r>
-        <w:t xml:space="preserve"> </w:t>
-      </w:r>
-      <w:proofErr w:type="spellStart"/>
-      <w:r>
-        <w:t>medida</w:t>
-      </w:r>
-      <w:proofErr w:type="spellEnd"/>
-      <w:r>
-        <w:t xml:space="preserve"> das </w:t>
-      </w:r>
-      <w:proofErr w:type="spellStart"/>
-      <w:r>
-        <w:t>explosões</w:t>
-      </w:r>
-      <w:proofErr w:type="spellEnd"/>
-      <w:r>
-        <w:t xml:space="preserve"> de Supernovas Tipo Ia (SN1A).”(</w:t>
-      </w:r>
-      <w:r>
-        <w:rPr>
-          <w:color w:val="EE0000"/>
-        </w:rPr>
-        <w:t>Maio/2026</w:t>
-      </w:r>
-      <w:r>
-        <w:t>)</w:t>
-      </w:r>
+      <w:hyperlink r:id="rId32" w:history="1">
+        <w:r>
+          <w:rPr>
+            <w:rStyle w:val="Hyperlink"/>
+          </w:rPr>
+          <w:t>https://jocaxx.github.io/DUniverse/Html/POR_DUT_GAL.htm</w:t>
+        </w:r>
+      </w:hyperlink>
     </w:p>
     <w:p>
       <w:pPr>
@@ -4404,7 +4086,389 @@
           <w:bottom w:val="single" w:sz="6" w:space="1" w:color="auto"/>
         </w:pBdr>
       </w:pPr>
-      <w:hyperlink r:id="rId29" w:history="1">
+    </w:p>
+    <w:p>
+      <w:pPr>
+        <w:pStyle w:val="Corpodetexto"/>
+      </w:pPr>
+    </w:p>
+    <w:p>
+      <w:pPr>
+        <w:pStyle w:val="Corpodetexto"/>
+        <w:rPr>
+          <w:color w:val="17365D" w:themeColor="text2" w:themeShade="BF"/>
+          <w:sz w:val="28"/>
+          <w:szCs w:val="28"/>
+        </w:rPr>
+      </w:pPr>
+      <w:r>
+        <w:rPr>
+          <w:b/>
+          <w:bCs/>
+          <w:color w:val="17365D" w:themeColor="text2" w:themeShade="BF"/>
+          <w:sz w:val="28"/>
+          <w:szCs w:val="28"/>
+        </w:rPr>
+        <w:t>(</w:t>
+      </w:r>
+      <w:r>
+        <w:rPr>
+          <w:b/>
+          <w:bCs/>
+          <w:color w:val="EE0000"/>
+          <w:sz w:val="28"/>
+          <w:szCs w:val="28"/>
+        </w:rPr>
+        <w:t>*</w:t>
+      </w:r>
+      <w:r>
+        <w:rPr>
+          <w:b/>
+          <w:bCs/>
+          <w:color w:val="17365D" w:themeColor="text2" w:themeShade="BF"/>
+          <w:sz w:val="28"/>
+          <w:szCs w:val="28"/>
+        </w:rPr>
+        <w:t xml:space="preserve">)Teoria do Universo </w:t>
+      </w:r>
+      <w:proofErr w:type="spellStart"/>
+      <w:r>
+        <w:rPr>
+          <w:b/>
+          <w:bCs/>
+          <w:color w:val="17365D" w:themeColor="text2" w:themeShade="BF"/>
+          <w:sz w:val="28"/>
+          <w:szCs w:val="28"/>
+        </w:rPr>
+        <w:t>Decrescente</w:t>
+      </w:r>
+      <w:proofErr w:type="spellEnd"/>
+      <w:r>
+        <w:rPr>
+          <w:b/>
+          <w:bCs/>
+          <w:color w:val="17365D" w:themeColor="text2" w:themeShade="BF"/>
+          <w:sz w:val="28"/>
+          <w:szCs w:val="28"/>
+        </w:rPr>
+        <w:t xml:space="preserve">: </w:t>
+      </w:r>
+      <w:proofErr w:type="spellStart"/>
+      <w:r>
+        <w:rPr>
+          <w:b/>
+          <w:bCs/>
+          <w:color w:val="17365D" w:themeColor="text2" w:themeShade="BF"/>
+          <w:sz w:val="28"/>
+          <w:szCs w:val="28"/>
+        </w:rPr>
+        <w:t>Dilatação</w:t>
+      </w:r>
+      <w:proofErr w:type="spellEnd"/>
+      <w:r>
+        <w:rPr>
+          <w:b/>
+          <w:bCs/>
+          <w:color w:val="17365D" w:themeColor="text2" w:themeShade="BF"/>
+          <w:sz w:val="28"/>
+          <w:szCs w:val="28"/>
+        </w:rPr>
+        <w:t xml:space="preserve"> Temporal </w:t>
+      </w:r>
+      <w:proofErr w:type="spellStart"/>
+      <w:r>
+        <w:rPr>
+          <w:b/>
+          <w:bCs/>
+          <w:color w:val="17365D" w:themeColor="text2" w:themeShade="BF"/>
+          <w:sz w:val="28"/>
+          <w:szCs w:val="28"/>
+        </w:rPr>
+        <w:t>Cosmológica</w:t>
+      </w:r>
+      <w:proofErr w:type="spellEnd"/>
+      <w:r>
+        <w:rPr>
+          <w:b/>
+          <w:bCs/>
+          <w:color w:val="17365D" w:themeColor="text2" w:themeShade="BF"/>
+          <w:sz w:val="28"/>
+          <w:szCs w:val="28"/>
+        </w:rPr>
+        <w:t xml:space="preserve"> e a </w:t>
+      </w:r>
+      <w:proofErr w:type="spellStart"/>
+      <w:r>
+        <w:rPr>
+          <w:b/>
+          <w:bCs/>
+          <w:color w:val="17365D" w:themeColor="text2" w:themeShade="BF"/>
+          <w:sz w:val="28"/>
+          <w:szCs w:val="28"/>
+        </w:rPr>
+        <w:t>Explosão</w:t>
+      </w:r>
+      <w:proofErr w:type="spellEnd"/>
+      <w:r>
+        <w:rPr>
+          <w:b/>
+          <w:bCs/>
+          <w:color w:val="17365D" w:themeColor="text2" w:themeShade="BF"/>
+          <w:sz w:val="28"/>
+          <w:szCs w:val="28"/>
+        </w:rPr>
+        <w:t xml:space="preserve"> de SN1A</w:t>
+      </w:r>
+    </w:p>
+    <w:p>
+      <w:pPr>
+        <w:pStyle w:val="Corpodetexto"/>
+      </w:pPr>
+      <w:r>
+        <w:t>“</w:t>
+      </w:r>
+      <w:proofErr w:type="spellStart"/>
+      <w:r>
+        <w:t>Mostraremos</w:t>
+      </w:r>
+      <w:proofErr w:type="spellEnd"/>
+      <w:r>
+        <w:t xml:space="preserve"> </w:t>
+      </w:r>
+      <w:proofErr w:type="spellStart"/>
+      <w:r>
+        <w:t>que</w:t>
+      </w:r>
+      <w:proofErr w:type="spellEnd"/>
+      <w:r>
+        <w:t xml:space="preserve">, </w:t>
+      </w:r>
+      <w:proofErr w:type="spellStart"/>
+      <w:r>
+        <w:t>dentro</w:t>
+      </w:r>
+      <w:proofErr w:type="spellEnd"/>
+      <w:r>
+        <w:t xml:space="preserve"> </w:t>
+      </w:r>
+      <w:proofErr w:type="spellStart"/>
+      <w:r>
+        <w:t>da”Teoria</w:t>
+      </w:r>
+      <w:proofErr w:type="spellEnd"/>
+      <w:r>
+        <w:t xml:space="preserve"> do Universo </w:t>
+      </w:r>
+      <w:proofErr w:type="spellStart"/>
+      <w:r>
+        <w:t>Decrescente</w:t>
+      </w:r>
+      <w:proofErr w:type="spellEnd"/>
+      <w:r>
+        <w:t xml:space="preserve">” (DUT), o tempo </w:t>
+      </w:r>
+      <w:proofErr w:type="spellStart"/>
+      <w:r>
+        <w:t>dentro</w:t>
+      </w:r>
+      <w:proofErr w:type="spellEnd"/>
+      <w:r>
+        <w:t xml:space="preserve"> de um campo </w:t>
+      </w:r>
+      <w:proofErr w:type="spellStart"/>
+      <w:r>
+        <w:t>gravitacional</w:t>
+      </w:r>
+      <w:proofErr w:type="spellEnd"/>
+      <w:r>
+        <w:t xml:space="preserve"> é </w:t>
+      </w:r>
+      <w:proofErr w:type="spellStart"/>
+      <w:r>
+        <w:t>alterado</w:t>
+      </w:r>
+      <w:proofErr w:type="spellEnd"/>
+      <w:r>
+        <w:t xml:space="preserve"> da </w:t>
+      </w:r>
+      <w:proofErr w:type="spellStart"/>
+      <w:r>
+        <w:t>mesma</w:t>
+      </w:r>
+      <w:proofErr w:type="spellEnd"/>
+      <w:r>
+        <w:t xml:space="preserve"> forma </w:t>
+      </w:r>
+      <w:proofErr w:type="spellStart"/>
+      <w:r>
+        <w:t>que</w:t>
+      </w:r>
+      <w:proofErr w:type="spellEnd"/>
+      <w:r>
+        <w:t xml:space="preserve"> as </w:t>
+      </w:r>
+      <w:proofErr w:type="spellStart"/>
+      <w:r>
+        <w:t>escalas</w:t>
+      </w:r>
+      <w:proofErr w:type="spellEnd"/>
+      <w:r>
+        <w:t xml:space="preserve"> de </w:t>
+      </w:r>
+      <w:proofErr w:type="spellStart"/>
+      <w:r>
+        <w:t>medição</w:t>
+      </w:r>
+      <w:proofErr w:type="spellEnd"/>
+      <w:r>
+        <w:t xml:space="preserve"> de </w:t>
+      </w:r>
+      <w:proofErr w:type="spellStart"/>
+      <w:r>
+        <w:t>distância</w:t>
+      </w:r>
+      <w:proofErr w:type="spellEnd"/>
+      <w:r>
+        <w:t xml:space="preserve"> </w:t>
+      </w:r>
+      <w:proofErr w:type="spellStart"/>
+      <w:r>
+        <w:t>espacial</w:t>
+      </w:r>
+      <w:proofErr w:type="spellEnd"/>
+      <w:r>
+        <w:t xml:space="preserve">. Em </w:t>
+      </w:r>
+      <w:proofErr w:type="spellStart"/>
+      <w:r>
+        <w:t>escala</w:t>
+      </w:r>
+      <w:proofErr w:type="spellEnd"/>
+      <w:r>
+        <w:t xml:space="preserve"> </w:t>
+      </w:r>
+      <w:proofErr w:type="spellStart"/>
+      <w:r>
+        <w:t>cósmica</w:t>
+      </w:r>
+      <w:proofErr w:type="spellEnd"/>
+      <w:r>
+        <w:t xml:space="preserve"> (</w:t>
+      </w:r>
+      <w:proofErr w:type="spellStart"/>
+      <w:r>
+        <w:t>períodos</w:t>
+      </w:r>
+      <w:proofErr w:type="spellEnd"/>
+      <w:r>
+        <w:t xml:space="preserve"> de </w:t>
+      </w:r>
+      <w:proofErr w:type="spellStart"/>
+      <w:r>
+        <w:t>milhões</w:t>
+      </w:r>
+      <w:proofErr w:type="spellEnd"/>
+      <w:r>
+        <w:t xml:space="preserve"> de </w:t>
+      </w:r>
+      <w:proofErr w:type="spellStart"/>
+      <w:r>
+        <w:t>anos</w:t>
+      </w:r>
+      <w:proofErr w:type="spellEnd"/>
+      <w:r>
+        <w:t xml:space="preserve">), esse </w:t>
+      </w:r>
+      <w:proofErr w:type="spellStart"/>
+      <w:r>
+        <w:t>efeito</w:t>
+      </w:r>
+      <w:proofErr w:type="spellEnd"/>
+      <w:r>
+        <w:t xml:space="preserve"> </w:t>
+      </w:r>
+      <w:proofErr w:type="spellStart"/>
+      <w:r>
+        <w:t>torna</w:t>
+      </w:r>
+      <w:proofErr w:type="spellEnd"/>
+      <w:r>
+        <w:t xml:space="preserve">-se </w:t>
+      </w:r>
+      <w:proofErr w:type="spellStart"/>
+      <w:r>
+        <w:t>perceptível</w:t>
+      </w:r>
+      <w:proofErr w:type="spellEnd"/>
+      <w:r>
+        <w:t xml:space="preserve"> e </w:t>
+      </w:r>
+      <w:proofErr w:type="spellStart"/>
+      <w:r>
+        <w:t>explica</w:t>
+      </w:r>
+      <w:proofErr w:type="spellEnd"/>
+      <w:r>
+        <w:t xml:space="preserve"> a </w:t>
+      </w:r>
+      <w:proofErr w:type="spellStart"/>
+      <w:r>
+        <w:t>variação</w:t>
+      </w:r>
+      <w:proofErr w:type="spellEnd"/>
+      <w:r>
+        <w:t xml:space="preserve"> </w:t>
+      </w:r>
+      <w:proofErr w:type="spellStart"/>
+      <w:r>
+        <w:t>na</w:t>
+      </w:r>
+      <w:proofErr w:type="spellEnd"/>
+      <w:r>
+        <w:t xml:space="preserve"> </w:t>
+      </w:r>
+      <w:proofErr w:type="spellStart"/>
+      <w:r>
+        <w:t>duração</w:t>
+      </w:r>
+      <w:proofErr w:type="spellEnd"/>
+      <w:r>
+        <w:t xml:space="preserve"> </w:t>
+      </w:r>
+      <w:proofErr w:type="spellStart"/>
+      <w:r>
+        <w:t>medida</w:t>
+      </w:r>
+      <w:proofErr w:type="spellEnd"/>
+      <w:r>
+        <w:t xml:space="preserve"> das </w:t>
+      </w:r>
+      <w:proofErr w:type="spellStart"/>
+      <w:r>
+        <w:t>explosões</w:t>
+      </w:r>
+      <w:proofErr w:type="spellEnd"/>
+      <w:r>
+        <w:t xml:space="preserve"> de Supernovas Tipo Ia (SN1A).”(</w:t>
+      </w:r>
+      <w:r>
+        <w:rPr>
+          <w:color w:val="EE0000"/>
+        </w:rPr>
+        <w:t>Maio/2026</w:t>
+      </w:r>
+      <w:r>
+        <w:t>)</w:t>
+      </w:r>
+    </w:p>
+    <w:p>
+      <w:pPr>
+        <w:pStyle w:val="Corpodetexto"/>
+        <w:pBdr>
+          <w:bottom w:val="single" w:sz="6" w:space="1" w:color="auto"/>
+        </w:pBdr>
+      </w:pPr>
+      <w:hyperlink r:id="rId33" w:history="1">
         <w:r>
           <w:rPr>
             <w:rStyle w:val="Hyperlink"/>
@@ -4420,701 +4484,14 @@
           <w:bottom w:val="single" w:sz="6" w:space="1" w:color="auto"/>
         </w:pBdr>
       </w:pPr>
-    </w:p>
-    <w:p>
-      <w:pPr>
-        <w:pStyle w:val="FirstParagraph"/>
-        <w:rPr>
-          <w:b/>
-          <w:bCs/>
-          <w:color w:val="17365D" w:themeColor="text2" w:themeShade="BF"/>
-        </w:rPr>
-      </w:pPr>
-    </w:p>
-    <w:p>
-      <w:pPr>
-        <w:pStyle w:val="FirstParagraph"/>
-        <w:rPr>
-          <w:color w:val="17365D" w:themeColor="text2" w:themeShade="BF"/>
-          <w:sz w:val="28"/>
-          <w:szCs w:val="28"/>
-        </w:rPr>
-      </w:pPr>
-      <w:r>
-        <w:rPr>
-          <w:b/>
-          <w:bCs/>
-          <w:color w:val="17365D" w:themeColor="text2" w:themeShade="BF"/>
-          <w:sz w:val="28"/>
-          <w:szCs w:val="28"/>
-        </w:rPr>
-        <w:t xml:space="preserve">DUT FAQ: </w:t>
-      </w:r>
-      <w:proofErr w:type="spellStart"/>
-      <w:r>
-        <w:rPr>
-          <w:b/>
-          <w:bCs/>
-          <w:color w:val="17365D" w:themeColor="text2" w:themeShade="BF"/>
-          <w:sz w:val="28"/>
-          <w:szCs w:val="28"/>
-        </w:rPr>
-        <w:t>Perguntas</w:t>
-      </w:r>
-      <w:proofErr w:type="spellEnd"/>
-      <w:r>
-        <w:rPr>
-          <w:b/>
-          <w:bCs/>
-          <w:color w:val="17365D" w:themeColor="text2" w:themeShade="BF"/>
-          <w:sz w:val="28"/>
-          <w:szCs w:val="28"/>
-        </w:rPr>
-        <w:t xml:space="preserve"> </w:t>
-      </w:r>
-      <w:proofErr w:type="spellStart"/>
-      <w:r>
-        <w:rPr>
-          <w:b/>
-          <w:bCs/>
-          <w:color w:val="17365D" w:themeColor="text2" w:themeShade="BF"/>
-          <w:sz w:val="28"/>
-          <w:szCs w:val="28"/>
-        </w:rPr>
-        <w:t>Frequentes</w:t>
-      </w:r>
-      <w:proofErr w:type="spellEnd"/>
-      <w:r>
-        <w:rPr>
-          <w:b/>
-          <w:bCs/>
-          <w:color w:val="17365D" w:themeColor="text2" w:themeShade="BF"/>
-          <w:sz w:val="28"/>
-          <w:szCs w:val="28"/>
-        </w:rPr>
-        <w:t xml:space="preserve"> </w:t>
-      </w:r>
-      <w:proofErr w:type="spellStart"/>
-      <w:r>
-        <w:rPr>
-          <w:b/>
-          <w:bCs/>
-          <w:color w:val="17365D" w:themeColor="text2" w:themeShade="BF"/>
-          <w:sz w:val="28"/>
-          <w:szCs w:val="28"/>
-        </w:rPr>
-        <w:t>sobre</w:t>
-      </w:r>
-      <w:proofErr w:type="spellEnd"/>
-      <w:r>
-        <w:rPr>
-          <w:b/>
-          <w:bCs/>
-          <w:color w:val="17365D" w:themeColor="text2" w:themeShade="BF"/>
-          <w:sz w:val="28"/>
-          <w:szCs w:val="28"/>
-        </w:rPr>
-        <w:t xml:space="preserve"> a “Teoria do Universo </w:t>
-      </w:r>
-      <w:proofErr w:type="spellStart"/>
-      <w:r>
-        <w:rPr>
-          <w:b/>
-          <w:bCs/>
-          <w:color w:val="17365D" w:themeColor="text2" w:themeShade="BF"/>
-          <w:sz w:val="28"/>
-          <w:szCs w:val="28"/>
-        </w:rPr>
-        <w:t>Decrescente</w:t>
-      </w:r>
-      <w:proofErr w:type="spellEnd"/>
-      <w:r>
-        <w:rPr>
-          <w:b/>
-          <w:bCs/>
-          <w:color w:val="17365D" w:themeColor="text2" w:themeShade="BF"/>
-          <w:sz w:val="28"/>
-          <w:szCs w:val="28"/>
-        </w:rPr>
-        <w:t>”</w:t>
-      </w:r>
-    </w:p>
-    <w:p>
-      <w:pPr>
-        <w:pStyle w:val="Corpodetexto"/>
-      </w:pPr>
-      <w:r>
-        <w:t xml:space="preserve">“Este </w:t>
-      </w:r>
-      <w:proofErr w:type="spellStart"/>
-      <w:r>
-        <w:t>documento</w:t>
-      </w:r>
-      <w:proofErr w:type="spellEnd"/>
-      <w:r>
-        <w:t xml:space="preserve"> </w:t>
-      </w:r>
-      <w:proofErr w:type="spellStart"/>
-      <w:r>
-        <w:t>apresenta</w:t>
-      </w:r>
-      <w:proofErr w:type="spellEnd"/>
-      <w:r>
-        <w:t xml:space="preserve"> </w:t>
-      </w:r>
-      <w:proofErr w:type="spellStart"/>
-      <w:r>
-        <w:t>os</w:t>
-      </w:r>
-      <w:proofErr w:type="spellEnd"/>
-      <w:r>
-        <w:t xml:space="preserve"> </w:t>
-      </w:r>
-      <w:proofErr w:type="spellStart"/>
-      <w:r>
-        <w:t>fundamentos</w:t>
-      </w:r>
-      <w:proofErr w:type="spellEnd"/>
-      <w:r>
-        <w:t xml:space="preserve"> da Teoria do Universo </w:t>
-      </w:r>
-      <w:proofErr w:type="spellStart"/>
-      <w:r>
-        <w:t>Decrescente</w:t>
-      </w:r>
-      <w:proofErr w:type="spellEnd"/>
-      <w:r>
-        <w:t xml:space="preserve"> (DUT), </w:t>
-      </w:r>
-      <w:proofErr w:type="spellStart"/>
-      <w:r>
-        <w:t>propondo</w:t>
-      </w:r>
-      <w:proofErr w:type="spellEnd"/>
-      <w:r>
-        <w:t xml:space="preserve"> </w:t>
-      </w:r>
-      <w:proofErr w:type="spellStart"/>
-      <w:r>
-        <w:t>que</w:t>
-      </w:r>
-      <w:proofErr w:type="spellEnd"/>
-      <w:r>
-        <w:t xml:space="preserve"> a </w:t>
-      </w:r>
-      <w:proofErr w:type="spellStart"/>
-      <w:r>
-        <w:t>origem</w:t>
-      </w:r>
-      <w:proofErr w:type="spellEnd"/>
-      <w:r>
-        <w:t xml:space="preserve"> de </w:t>
-      </w:r>
-      <w:proofErr w:type="spellStart"/>
-      <w:r>
-        <w:t>tudo</w:t>
-      </w:r>
-      <w:proofErr w:type="spellEnd"/>
-      <w:r>
-        <w:t xml:space="preserve"> </w:t>
-      </w:r>
-      <w:proofErr w:type="spellStart"/>
-      <w:r>
-        <w:t>está</w:t>
-      </w:r>
-      <w:proofErr w:type="spellEnd"/>
-      <w:r>
-        <w:t xml:space="preserve"> no </w:t>
-      </w:r>
-      <w:proofErr w:type="spellStart"/>
-      <w:r>
-        <w:t>conceito</w:t>
-      </w:r>
-      <w:proofErr w:type="spellEnd"/>
-      <w:r>
-        <w:t xml:space="preserve"> </w:t>
-      </w:r>
-      <w:proofErr w:type="spellStart"/>
-      <w:r>
-        <w:t>do”Nada</w:t>
-      </w:r>
-      <w:proofErr w:type="spellEnd"/>
-      <w:r>
-        <w:t xml:space="preserve"> Jocaxiano”, </w:t>
-      </w:r>
-      <w:proofErr w:type="spellStart"/>
-      <w:r>
-        <w:t>em</w:t>
-      </w:r>
-      <w:proofErr w:type="spellEnd"/>
-      <w:r>
-        <w:t xml:space="preserve"> </w:t>
-      </w:r>
-      <w:proofErr w:type="spellStart"/>
-      <w:r>
-        <w:t>vez</w:t>
-      </w:r>
-      <w:proofErr w:type="spellEnd"/>
-      <w:r>
-        <w:t xml:space="preserve"> do Big Bang </w:t>
-      </w:r>
-      <w:proofErr w:type="spellStart"/>
-      <w:r>
-        <w:t>tradicional</w:t>
-      </w:r>
-      <w:proofErr w:type="spellEnd"/>
-      <w:r>
-        <w:t xml:space="preserve">. A </w:t>
-      </w:r>
-      <w:proofErr w:type="spellStart"/>
-      <w:r>
-        <w:t>premissa</w:t>
-      </w:r>
-      <w:proofErr w:type="spellEnd"/>
-      <w:r>
-        <w:t xml:space="preserve"> central </w:t>
-      </w:r>
-      <w:proofErr w:type="spellStart"/>
-      <w:r>
-        <w:t>sugere</w:t>
-      </w:r>
-      <w:proofErr w:type="spellEnd"/>
-      <w:r>
-        <w:t xml:space="preserve"> </w:t>
-      </w:r>
-      <w:proofErr w:type="spellStart"/>
-      <w:r>
-        <w:t>que</w:t>
-      </w:r>
-      <w:proofErr w:type="spellEnd"/>
-      <w:r>
-        <w:t xml:space="preserve"> a </w:t>
-      </w:r>
-      <w:proofErr w:type="spellStart"/>
-      <w:r>
-        <w:t>gravidade</w:t>
-      </w:r>
-      <w:proofErr w:type="spellEnd"/>
-      <w:r>
-        <w:t xml:space="preserve"> causa </w:t>
-      </w:r>
-      <w:proofErr w:type="spellStart"/>
-      <w:r>
-        <w:t>uma</w:t>
-      </w:r>
-      <w:proofErr w:type="spellEnd"/>
-      <w:r>
-        <w:t xml:space="preserve"> </w:t>
-      </w:r>
-      <w:proofErr w:type="spellStart"/>
-      <w:r>
-        <w:t>contração</w:t>
-      </w:r>
-      <w:proofErr w:type="spellEnd"/>
-      <w:r>
-        <w:t xml:space="preserve"> </w:t>
-      </w:r>
-      <w:proofErr w:type="spellStart"/>
-      <w:r>
-        <w:t>contínua</w:t>
-      </w:r>
-      <w:proofErr w:type="spellEnd"/>
-      <w:r>
-        <w:t xml:space="preserve"> da </w:t>
-      </w:r>
-      <w:proofErr w:type="spellStart"/>
-      <w:r>
-        <w:t>matéria</w:t>
-      </w:r>
-      <w:proofErr w:type="spellEnd"/>
-      <w:r>
-        <w:t xml:space="preserve"> e dos </w:t>
-      </w:r>
-      <w:proofErr w:type="spellStart"/>
-      <w:r>
-        <w:t>sistemas</w:t>
-      </w:r>
-      <w:proofErr w:type="spellEnd"/>
-      <w:r>
-        <w:t xml:space="preserve"> </w:t>
-      </w:r>
-      <w:proofErr w:type="spellStart"/>
-      <w:r>
-        <w:t>físicos</w:t>
-      </w:r>
-      <w:proofErr w:type="spellEnd"/>
-      <w:r>
-        <w:t xml:space="preserve">, </w:t>
-      </w:r>
-      <w:proofErr w:type="spellStart"/>
-      <w:r>
-        <w:t>desafiando</w:t>
-      </w:r>
-      <w:proofErr w:type="spellEnd"/>
-      <w:r>
-        <w:t xml:space="preserve"> a </w:t>
-      </w:r>
-      <w:proofErr w:type="spellStart"/>
-      <w:r>
-        <w:t>percepção</w:t>
-      </w:r>
-      <w:proofErr w:type="spellEnd"/>
-      <w:r>
-        <w:t xml:space="preserve"> de </w:t>
-      </w:r>
-      <w:proofErr w:type="spellStart"/>
-      <w:r>
-        <w:t>uma</w:t>
-      </w:r>
-      <w:proofErr w:type="spellEnd"/>
-      <w:r>
-        <w:t xml:space="preserve"> </w:t>
-      </w:r>
-      <w:proofErr w:type="spellStart"/>
-      <w:r>
-        <w:t>expansão</w:t>
-      </w:r>
-      <w:proofErr w:type="spellEnd"/>
-      <w:r>
-        <w:t xml:space="preserve"> </w:t>
-      </w:r>
-      <w:proofErr w:type="spellStart"/>
-      <w:r>
-        <w:t>acelerada</w:t>
-      </w:r>
-      <w:proofErr w:type="spellEnd"/>
-      <w:r>
-        <w:t xml:space="preserve"> do cosmos. Ao </w:t>
-      </w:r>
-      <w:proofErr w:type="spellStart"/>
-      <w:r>
-        <w:t>contrário</w:t>
-      </w:r>
-      <w:proofErr w:type="spellEnd"/>
-      <w:r>
-        <w:t xml:space="preserve"> de outros </w:t>
-      </w:r>
-      <w:proofErr w:type="spellStart"/>
-      <w:r>
-        <w:t>modelos</w:t>
-      </w:r>
-      <w:proofErr w:type="spellEnd"/>
-      <w:r>
-        <w:t xml:space="preserve">, a DUT </w:t>
-      </w:r>
-      <w:proofErr w:type="spellStart"/>
-      <w:r>
-        <w:t>concebe</w:t>
-      </w:r>
-      <w:proofErr w:type="spellEnd"/>
-      <w:r>
-        <w:t xml:space="preserve"> o </w:t>
-      </w:r>
-      <w:proofErr w:type="spellStart"/>
-      <w:r>
-        <w:t>espaço</w:t>
-      </w:r>
-      <w:proofErr w:type="spellEnd"/>
-      <w:r>
-        <w:t xml:space="preserve"> </w:t>
-      </w:r>
-      <w:proofErr w:type="spellStart"/>
-      <w:r>
-        <w:t>como</w:t>
-      </w:r>
-      <w:proofErr w:type="spellEnd"/>
-      <w:r>
-        <w:t xml:space="preserve"> um </w:t>
-      </w:r>
-      <w:proofErr w:type="spellStart"/>
-      <w:r>
-        <w:t>vácuo</w:t>
-      </w:r>
-      <w:proofErr w:type="spellEnd"/>
-      <w:r>
-        <w:t xml:space="preserve"> </w:t>
-      </w:r>
-      <w:proofErr w:type="spellStart"/>
-      <w:r>
-        <w:t>imutável</w:t>
-      </w:r>
-      <w:proofErr w:type="spellEnd"/>
-      <w:r>
-        <w:t xml:space="preserve">, no qual </w:t>
-      </w:r>
-      <w:proofErr w:type="spellStart"/>
-      <w:r>
-        <w:t>apenas</w:t>
-      </w:r>
-      <w:proofErr w:type="spellEnd"/>
-      <w:r>
-        <w:t xml:space="preserve"> </w:t>
-      </w:r>
-      <w:proofErr w:type="spellStart"/>
-      <w:r>
-        <w:t>os</w:t>
-      </w:r>
-      <w:proofErr w:type="spellEnd"/>
-      <w:r>
-        <w:t xml:space="preserve"> </w:t>
-      </w:r>
-      <w:proofErr w:type="spellStart"/>
-      <w:r>
-        <w:t>elementos</w:t>
-      </w:r>
-      <w:proofErr w:type="spellEnd"/>
-      <w:r>
-        <w:t xml:space="preserve"> </w:t>
-      </w:r>
-      <w:proofErr w:type="spellStart"/>
-      <w:r>
-        <w:t>materiais</w:t>
-      </w:r>
-      <w:proofErr w:type="spellEnd"/>
-      <w:r>
-        <w:t xml:space="preserve"> </w:t>
-      </w:r>
-      <w:proofErr w:type="spellStart"/>
-      <w:r>
-        <w:t>diminuem</w:t>
-      </w:r>
-      <w:proofErr w:type="spellEnd"/>
-      <w:r>
-        <w:t xml:space="preserve"> de </w:t>
-      </w:r>
-      <w:proofErr w:type="spellStart"/>
-      <w:r>
-        <w:t>escala</w:t>
-      </w:r>
-      <w:proofErr w:type="spellEnd"/>
-      <w:r>
-        <w:t xml:space="preserve"> </w:t>
-      </w:r>
-      <w:proofErr w:type="spellStart"/>
-      <w:r>
-        <w:t>ao</w:t>
-      </w:r>
-      <w:proofErr w:type="spellEnd"/>
-      <w:r>
-        <w:t xml:space="preserve"> </w:t>
-      </w:r>
-      <w:proofErr w:type="spellStart"/>
-      <w:r>
-        <w:t>longo</w:t>
-      </w:r>
-      <w:proofErr w:type="spellEnd"/>
-      <w:r>
-        <w:t xml:space="preserve"> do tempo. O </w:t>
-      </w:r>
-      <w:proofErr w:type="spellStart"/>
-      <w:r>
-        <w:t>texto</w:t>
-      </w:r>
-      <w:proofErr w:type="spellEnd"/>
-      <w:r>
-        <w:t xml:space="preserve"> argumenta </w:t>
-      </w:r>
-      <w:proofErr w:type="spellStart"/>
-      <w:r>
-        <w:t>que</w:t>
-      </w:r>
-      <w:proofErr w:type="spellEnd"/>
-      <w:r>
-        <w:t xml:space="preserve"> </w:t>
-      </w:r>
-      <w:proofErr w:type="spellStart"/>
-      <w:r>
-        <w:t>essa</w:t>
-      </w:r>
-      <w:proofErr w:type="spellEnd"/>
-      <w:r>
-        <w:t xml:space="preserve"> nova </w:t>
-      </w:r>
-      <w:proofErr w:type="spellStart"/>
-      <w:r>
-        <w:t>perspectiva</w:t>
-      </w:r>
-      <w:proofErr w:type="spellEnd"/>
-      <w:r>
-        <w:t xml:space="preserve"> </w:t>
-      </w:r>
-      <w:proofErr w:type="spellStart"/>
-      <w:r>
-        <w:t>exige</w:t>
-      </w:r>
-      <w:proofErr w:type="spellEnd"/>
-      <w:r>
-        <w:t xml:space="preserve"> </w:t>
-      </w:r>
-      <w:proofErr w:type="spellStart"/>
-      <w:r>
-        <w:t>uma</w:t>
-      </w:r>
-      <w:proofErr w:type="spellEnd"/>
-      <w:r>
-        <w:t xml:space="preserve"> </w:t>
-      </w:r>
-      <w:proofErr w:type="spellStart"/>
-      <w:r>
-        <w:t>revisão</w:t>
-      </w:r>
-      <w:proofErr w:type="spellEnd"/>
-      <w:r>
-        <w:t xml:space="preserve"> da </w:t>
-      </w:r>
-      <w:proofErr w:type="spellStart"/>
-      <w:r>
-        <w:t>Relatividade</w:t>
-      </w:r>
-      <w:proofErr w:type="spellEnd"/>
-      <w:r>
-        <w:t xml:space="preserve"> Geral, </w:t>
-      </w:r>
-      <w:proofErr w:type="spellStart"/>
-      <w:r>
-        <w:t>permanecendo</w:t>
-      </w:r>
-      <w:proofErr w:type="spellEnd"/>
-      <w:r>
-        <w:t xml:space="preserve"> </w:t>
-      </w:r>
-      <w:proofErr w:type="spellStart"/>
-      <w:r>
-        <w:t>compatível</w:t>
-      </w:r>
-      <w:proofErr w:type="spellEnd"/>
-      <w:r>
-        <w:t xml:space="preserve"> com </w:t>
-      </w:r>
-      <w:proofErr w:type="spellStart"/>
-      <w:r>
-        <w:t>os</w:t>
-      </w:r>
-      <w:proofErr w:type="spellEnd"/>
-      <w:r>
-        <w:t xml:space="preserve"> </w:t>
-      </w:r>
-      <w:proofErr w:type="spellStart"/>
-      <w:r>
-        <w:t>princípios</w:t>
-      </w:r>
-      <w:proofErr w:type="spellEnd"/>
-      <w:r>
-        <w:t xml:space="preserve"> da </w:t>
-      </w:r>
-      <w:proofErr w:type="spellStart"/>
-      <w:r>
-        <w:t>Mecânica</w:t>
-      </w:r>
-      <w:proofErr w:type="spellEnd"/>
-      <w:r>
-        <w:t xml:space="preserve"> </w:t>
-      </w:r>
-      <w:proofErr w:type="spellStart"/>
-      <w:r>
-        <w:t>Quântica</w:t>
-      </w:r>
-      <w:proofErr w:type="spellEnd"/>
-      <w:r>
-        <w:t xml:space="preserve">. Por </w:t>
-      </w:r>
-      <w:proofErr w:type="spellStart"/>
-      <w:r>
-        <w:t>fim</w:t>
-      </w:r>
-      <w:proofErr w:type="spellEnd"/>
-      <w:r>
-        <w:t xml:space="preserve">, o </w:t>
-      </w:r>
-      <w:proofErr w:type="spellStart"/>
-      <w:r>
-        <w:t>autor</w:t>
-      </w:r>
-      <w:proofErr w:type="spellEnd"/>
-      <w:r>
-        <w:t xml:space="preserve"> </w:t>
-      </w:r>
-      <w:proofErr w:type="spellStart"/>
-      <w:r>
-        <w:t>esclarece</w:t>
-      </w:r>
-      <w:proofErr w:type="spellEnd"/>
-      <w:r>
-        <w:t xml:space="preserve"> </w:t>
-      </w:r>
-      <w:proofErr w:type="spellStart"/>
-      <w:r>
-        <w:t>perguntas</w:t>
-      </w:r>
-      <w:proofErr w:type="spellEnd"/>
-      <w:r>
-        <w:t xml:space="preserve"> </w:t>
-      </w:r>
-      <w:proofErr w:type="spellStart"/>
-      <w:r>
-        <w:t>frequentes</w:t>
-      </w:r>
-      <w:proofErr w:type="spellEnd"/>
-      <w:r>
-        <w:t xml:space="preserve"> para </w:t>
-      </w:r>
-      <w:proofErr w:type="spellStart"/>
-      <w:r>
-        <w:t>estabelecer</w:t>
-      </w:r>
-      <w:proofErr w:type="spellEnd"/>
-      <w:r>
-        <w:t xml:space="preserve"> a DUT </w:t>
-      </w:r>
-      <w:proofErr w:type="spellStart"/>
-      <w:r>
-        <w:t>como</w:t>
-      </w:r>
-      <w:proofErr w:type="spellEnd"/>
-      <w:r>
-        <w:t xml:space="preserve"> um </w:t>
-      </w:r>
-      <w:proofErr w:type="spellStart"/>
-      <w:r>
-        <w:t>arcabouço</w:t>
-      </w:r>
-      <w:proofErr w:type="spellEnd"/>
-      <w:r>
-        <w:t xml:space="preserve"> </w:t>
-      </w:r>
-      <w:proofErr w:type="spellStart"/>
-      <w:r>
-        <w:t>teórico</w:t>
-      </w:r>
-      <w:proofErr w:type="spellEnd"/>
-      <w:r>
-        <w:t xml:space="preserve"> alternativo e </w:t>
-      </w:r>
-      <w:proofErr w:type="spellStart"/>
-      <w:r>
-        <w:t>abrangente</w:t>
-      </w:r>
-      <w:proofErr w:type="spellEnd"/>
-      <w:r>
-        <w:t xml:space="preserve"> para a </w:t>
-      </w:r>
-      <w:proofErr w:type="spellStart"/>
-      <w:r>
-        <w:t>cosmologia</w:t>
-      </w:r>
-      <w:proofErr w:type="spellEnd"/>
-      <w:r>
-        <w:t xml:space="preserve"> moderna. “(</w:t>
-      </w:r>
-      <w:r>
-        <w:rPr>
-          <w:color w:val="EE0000"/>
-        </w:rPr>
-        <w:t>Jun/2026</w:t>
-      </w:r>
-      <w:r>
-        <w:t>)</w:t>
-      </w:r>
+      <w:hyperlink r:id="rId34" w:history="1">
+        <w:r>
+          <w:rPr>
+            <w:rStyle w:val="Hyperlink"/>
+          </w:rPr>
+          <w:t>https://jocaxx.github.io/DUniverse/Html/POR_snova01.htm</w:t>
+        </w:r>
+      </w:hyperlink>
     </w:p>
     <w:p>
       <w:pPr>
@@ -5123,7 +4500,710 @@
           <w:bottom w:val="single" w:sz="6" w:space="1" w:color="auto"/>
         </w:pBdr>
       </w:pPr>
-      <w:hyperlink r:id="rId30" w:history="1">
+    </w:p>
+    <w:p>
+      <w:pPr>
+        <w:pStyle w:val="FirstParagraph"/>
+        <w:rPr>
+          <w:b/>
+          <w:bCs/>
+          <w:color w:val="17365D" w:themeColor="text2" w:themeShade="BF"/>
+        </w:rPr>
+      </w:pPr>
+    </w:p>
+    <w:p>
+      <w:pPr>
+        <w:pStyle w:val="FirstParagraph"/>
+        <w:rPr>
+          <w:color w:val="17365D" w:themeColor="text2" w:themeShade="BF"/>
+          <w:sz w:val="28"/>
+          <w:szCs w:val="28"/>
+        </w:rPr>
+      </w:pPr>
+      <w:r>
+        <w:rPr>
+          <w:b/>
+          <w:bCs/>
+          <w:color w:val="17365D" w:themeColor="text2" w:themeShade="BF"/>
+          <w:sz w:val="28"/>
+          <w:szCs w:val="28"/>
+        </w:rPr>
+        <w:t xml:space="preserve">DUT FAQ: </w:t>
+      </w:r>
+      <w:proofErr w:type="spellStart"/>
+      <w:r>
+        <w:rPr>
+          <w:b/>
+          <w:bCs/>
+          <w:color w:val="17365D" w:themeColor="text2" w:themeShade="BF"/>
+          <w:sz w:val="28"/>
+          <w:szCs w:val="28"/>
+        </w:rPr>
+        <w:t>Perguntas</w:t>
+      </w:r>
+      <w:proofErr w:type="spellEnd"/>
+      <w:r>
+        <w:rPr>
+          <w:b/>
+          <w:bCs/>
+          <w:color w:val="17365D" w:themeColor="text2" w:themeShade="BF"/>
+          <w:sz w:val="28"/>
+          <w:szCs w:val="28"/>
+        </w:rPr>
+        <w:t xml:space="preserve"> </w:t>
+      </w:r>
+      <w:proofErr w:type="spellStart"/>
+      <w:r>
+        <w:rPr>
+          <w:b/>
+          <w:bCs/>
+          <w:color w:val="17365D" w:themeColor="text2" w:themeShade="BF"/>
+          <w:sz w:val="28"/>
+          <w:szCs w:val="28"/>
+        </w:rPr>
+        <w:t>Frequentes</w:t>
+      </w:r>
+      <w:proofErr w:type="spellEnd"/>
+      <w:r>
+        <w:rPr>
+          <w:b/>
+          <w:bCs/>
+          <w:color w:val="17365D" w:themeColor="text2" w:themeShade="BF"/>
+          <w:sz w:val="28"/>
+          <w:szCs w:val="28"/>
+        </w:rPr>
+        <w:t xml:space="preserve"> </w:t>
+      </w:r>
+      <w:proofErr w:type="spellStart"/>
+      <w:r>
+        <w:rPr>
+          <w:b/>
+          <w:bCs/>
+          <w:color w:val="17365D" w:themeColor="text2" w:themeShade="BF"/>
+          <w:sz w:val="28"/>
+          <w:szCs w:val="28"/>
+        </w:rPr>
+        <w:t>sobre</w:t>
+      </w:r>
+      <w:proofErr w:type="spellEnd"/>
+      <w:r>
+        <w:rPr>
+          <w:b/>
+          <w:bCs/>
+          <w:color w:val="17365D" w:themeColor="text2" w:themeShade="BF"/>
+          <w:sz w:val="28"/>
+          <w:szCs w:val="28"/>
+        </w:rPr>
+        <w:t xml:space="preserve"> a “Teoria do Universo </w:t>
+      </w:r>
+      <w:proofErr w:type="spellStart"/>
+      <w:r>
+        <w:rPr>
+          <w:b/>
+          <w:bCs/>
+          <w:color w:val="17365D" w:themeColor="text2" w:themeShade="BF"/>
+          <w:sz w:val="28"/>
+          <w:szCs w:val="28"/>
+        </w:rPr>
+        <w:t>Decrescente</w:t>
+      </w:r>
+      <w:proofErr w:type="spellEnd"/>
+      <w:r>
+        <w:rPr>
+          <w:b/>
+          <w:bCs/>
+          <w:color w:val="17365D" w:themeColor="text2" w:themeShade="BF"/>
+          <w:sz w:val="28"/>
+          <w:szCs w:val="28"/>
+        </w:rPr>
+        <w:t>”</w:t>
+      </w:r>
+    </w:p>
+    <w:p>
+      <w:pPr>
+        <w:pStyle w:val="Corpodetexto"/>
+      </w:pPr>
+      <w:r>
+        <w:t xml:space="preserve">“Este </w:t>
+      </w:r>
+      <w:proofErr w:type="spellStart"/>
+      <w:r>
+        <w:t>documento</w:t>
+      </w:r>
+      <w:proofErr w:type="spellEnd"/>
+      <w:r>
+        <w:t xml:space="preserve"> </w:t>
+      </w:r>
+      <w:proofErr w:type="spellStart"/>
+      <w:r>
+        <w:t>apresenta</w:t>
+      </w:r>
+      <w:proofErr w:type="spellEnd"/>
+      <w:r>
+        <w:t xml:space="preserve"> </w:t>
+      </w:r>
+      <w:proofErr w:type="spellStart"/>
+      <w:r>
+        <w:t>os</w:t>
+      </w:r>
+      <w:proofErr w:type="spellEnd"/>
+      <w:r>
+        <w:t xml:space="preserve"> </w:t>
+      </w:r>
+      <w:proofErr w:type="spellStart"/>
+      <w:r>
+        <w:t>fundamentos</w:t>
+      </w:r>
+      <w:proofErr w:type="spellEnd"/>
+      <w:r>
+        <w:t xml:space="preserve"> da Teoria do Universo </w:t>
+      </w:r>
+      <w:proofErr w:type="spellStart"/>
+      <w:r>
+        <w:t>Decrescente</w:t>
+      </w:r>
+      <w:proofErr w:type="spellEnd"/>
+      <w:r>
+        <w:t xml:space="preserve"> (DUT), </w:t>
+      </w:r>
+      <w:proofErr w:type="spellStart"/>
+      <w:r>
+        <w:t>propondo</w:t>
+      </w:r>
+      <w:proofErr w:type="spellEnd"/>
+      <w:r>
+        <w:t xml:space="preserve"> </w:t>
+      </w:r>
+      <w:proofErr w:type="spellStart"/>
+      <w:r>
+        <w:t>que</w:t>
+      </w:r>
+      <w:proofErr w:type="spellEnd"/>
+      <w:r>
+        <w:t xml:space="preserve"> a </w:t>
+      </w:r>
+      <w:proofErr w:type="spellStart"/>
+      <w:r>
+        <w:t>origem</w:t>
+      </w:r>
+      <w:proofErr w:type="spellEnd"/>
+      <w:r>
+        <w:t xml:space="preserve"> de </w:t>
+      </w:r>
+      <w:proofErr w:type="spellStart"/>
+      <w:r>
+        <w:t>tudo</w:t>
+      </w:r>
+      <w:proofErr w:type="spellEnd"/>
+      <w:r>
+        <w:t xml:space="preserve"> </w:t>
+      </w:r>
+      <w:proofErr w:type="spellStart"/>
+      <w:r>
+        <w:t>está</w:t>
+      </w:r>
+      <w:proofErr w:type="spellEnd"/>
+      <w:r>
+        <w:t xml:space="preserve"> no </w:t>
+      </w:r>
+      <w:proofErr w:type="spellStart"/>
+      <w:r>
+        <w:t>conceito</w:t>
+      </w:r>
+      <w:proofErr w:type="spellEnd"/>
+      <w:r>
+        <w:t xml:space="preserve"> </w:t>
+      </w:r>
+      <w:proofErr w:type="spellStart"/>
+      <w:r>
+        <w:t>do”Nada</w:t>
+      </w:r>
+      <w:proofErr w:type="spellEnd"/>
+      <w:r>
+        <w:t xml:space="preserve"> Jocaxiano”, </w:t>
+      </w:r>
+      <w:proofErr w:type="spellStart"/>
+      <w:r>
+        <w:t>em</w:t>
+      </w:r>
+      <w:proofErr w:type="spellEnd"/>
+      <w:r>
+        <w:t xml:space="preserve"> </w:t>
+      </w:r>
+      <w:proofErr w:type="spellStart"/>
+      <w:r>
+        <w:t>vez</w:t>
+      </w:r>
+      <w:proofErr w:type="spellEnd"/>
+      <w:r>
+        <w:t xml:space="preserve"> do Big Bang </w:t>
+      </w:r>
+      <w:proofErr w:type="spellStart"/>
+      <w:r>
+        <w:t>tradicional</w:t>
+      </w:r>
+      <w:proofErr w:type="spellEnd"/>
+      <w:r>
+        <w:t xml:space="preserve">. A </w:t>
+      </w:r>
+      <w:proofErr w:type="spellStart"/>
+      <w:r>
+        <w:t>premissa</w:t>
+      </w:r>
+      <w:proofErr w:type="spellEnd"/>
+      <w:r>
+        <w:t xml:space="preserve"> central </w:t>
+      </w:r>
+      <w:proofErr w:type="spellStart"/>
+      <w:r>
+        <w:t>sugere</w:t>
+      </w:r>
+      <w:proofErr w:type="spellEnd"/>
+      <w:r>
+        <w:t xml:space="preserve"> </w:t>
+      </w:r>
+      <w:proofErr w:type="spellStart"/>
+      <w:r>
+        <w:t>que</w:t>
+      </w:r>
+      <w:proofErr w:type="spellEnd"/>
+      <w:r>
+        <w:t xml:space="preserve"> a </w:t>
+      </w:r>
+      <w:proofErr w:type="spellStart"/>
+      <w:r>
+        <w:t>gravidade</w:t>
+      </w:r>
+      <w:proofErr w:type="spellEnd"/>
+      <w:r>
+        <w:t xml:space="preserve"> causa </w:t>
+      </w:r>
+      <w:proofErr w:type="spellStart"/>
+      <w:r>
+        <w:t>uma</w:t>
+      </w:r>
+      <w:proofErr w:type="spellEnd"/>
+      <w:r>
+        <w:t xml:space="preserve"> </w:t>
+      </w:r>
+      <w:proofErr w:type="spellStart"/>
+      <w:r>
+        <w:t>contração</w:t>
+      </w:r>
+      <w:proofErr w:type="spellEnd"/>
+      <w:r>
+        <w:t xml:space="preserve"> </w:t>
+      </w:r>
+      <w:proofErr w:type="spellStart"/>
+      <w:r>
+        <w:t>contínua</w:t>
+      </w:r>
+      <w:proofErr w:type="spellEnd"/>
+      <w:r>
+        <w:t xml:space="preserve"> da </w:t>
+      </w:r>
+      <w:proofErr w:type="spellStart"/>
+      <w:r>
+        <w:t>matéria</w:t>
+      </w:r>
+      <w:proofErr w:type="spellEnd"/>
+      <w:r>
+        <w:t xml:space="preserve"> e dos </w:t>
+      </w:r>
+      <w:proofErr w:type="spellStart"/>
+      <w:r>
+        <w:t>sistemas</w:t>
+      </w:r>
+      <w:proofErr w:type="spellEnd"/>
+      <w:r>
+        <w:t xml:space="preserve"> </w:t>
+      </w:r>
+      <w:proofErr w:type="spellStart"/>
+      <w:r>
+        <w:t>físicos</w:t>
+      </w:r>
+      <w:proofErr w:type="spellEnd"/>
+      <w:r>
+        <w:t xml:space="preserve">, </w:t>
+      </w:r>
+      <w:proofErr w:type="spellStart"/>
+      <w:r>
+        <w:t>desafiando</w:t>
+      </w:r>
+      <w:proofErr w:type="spellEnd"/>
+      <w:r>
+        <w:t xml:space="preserve"> a </w:t>
+      </w:r>
+      <w:proofErr w:type="spellStart"/>
+      <w:r>
+        <w:t>percepção</w:t>
+      </w:r>
+      <w:proofErr w:type="spellEnd"/>
+      <w:r>
+        <w:t xml:space="preserve"> de </w:t>
+      </w:r>
+      <w:proofErr w:type="spellStart"/>
+      <w:r>
+        <w:t>uma</w:t>
+      </w:r>
+      <w:proofErr w:type="spellEnd"/>
+      <w:r>
+        <w:t xml:space="preserve"> </w:t>
+      </w:r>
+      <w:proofErr w:type="spellStart"/>
+      <w:r>
+        <w:t>expansão</w:t>
+      </w:r>
+      <w:proofErr w:type="spellEnd"/>
+      <w:r>
+        <w:t xml:space="preserve"> </w:t>
+      </w:r>
+      <w:proofErr w:type="spellStart"/>
+      <w:r>
+        <w:t>acelerada</w:t>
+      </w:r>
+      <w:proofErr w:type="spellEnd"/>
+      <w:r>
+        <w:t xml:space="preserve"> do cosmos. Ao </w:t>
+      </w:r>
+      <w:proofErr w:type="spellStart"/>
+      <w:r>
+        <w:t>contrário</w:t>
+      </w:r>
+      <w:proofErr w:type="spellEnd"/>
+      <w:r>
+        <w:t xml:space="preserve"> de outros </w:t>
+      </w:r>
+      <w:proofErr w:type="spellStart"/>
+      <w:r>
+        <w:t>modelos</w:t>
+      </w:r>
+      <w:proofErr w:type="spellEnd"/>
+      <w:r>
+        <w:t xml:space="preserve">, a DUT </w:t>
+      </w:r>
+      <w:proofErr w:type="spellStart"/>
+      <w:r>
+        <w:t>concebe</w:t>
+      </w:r>
+      <w:proofErr w:type="spellEnd"/>
+      <w:r>
+        <w:t xml:space="preserve"> o </w:t>
+      </w:r>
+      <w:proofErr w:type="spellStart"/>
+      <w:r>
+        <w:t>espaço</w:t>
+      </w:r>
+      <w:proofErr w:type="spellEnd"/>
+      <w:r>
+        <w:t xml:space="preserve"> </w:t>
+      </w:r>
+      <w:proofErr w:type="spellStart"/>
+      <w:r>
+        <w:t>como</w:t>
+      </w:r>
+      <w:proofErr w:type="spellEnd"/>
+      <w:r>
+        <w:t xml:space="preserve"> um </w:t>
+      </w:r>
+      <w:proofErr w:type="spellStart"/>
+      <w:r>
+        <w:t>vácuo</w:t>
+      </w:r>
+      <w:proofErr w:type="spellEnd"/>
+      <w:r>
+        <w:t xml:space="preserve"> </w:t>
+      </w:r>
+      <w:proofErr w:type="spellStart"/>
+      <w:r>
+        <w:t>imutável</w:t>
+      </w:r>
+      <w:proofErr w:type="spellEnd"/>
+      <w:r>
+        <w:t xml:space="preserve">, no qual </w:t>
+      </w:r>
+      <w:proofErr w:type="spellStart"/>
+      <w:r>
+        <w:t>apenas</w:t>
+      </w:r>
+      <w:proofErr w:type="spellEnd"/>
+      <w:r>
+        <w:t xml:space="preserve"> </w:t>
+      </w:r>
+      <w:proofErr w:type="spellStart"/>
+      <w:r>
+        <w:t>os</w:t>
+      </w:r>
+      <w:proofErr w:type="spellEnd"/>
+      <w:r>
+        <w:t xml:space="preserve"> </w:t>
+      </w:r>
+      <w:proofErr w:type="spellStart"/>
+      <w:r>
+        <w:t>elementos</w:t>
+      </w:r>
+      <w:proofErr w:type="spellEnd"/>
+      <w:r>
+        <w:t xml:space="preserve"> </w:t>
+      </w:r>
+      <w:proofErr w:type="spellStart"/>
+      <w:r>
+        <w:t>materiais</w:t>
+      </w:r>
+      <w:proofErr w:type="spellEnd"/>
+      <w:r>
+        <w:t xml:space="preserve"> </w:t>
+      </w:r>
+      <w:proofErr w:type="spellStart"/>
+      <w:r>
+        <w:t>diminuem</w:t>
+      </w:r>
+      <w:proofErr w:type="spellEnd"/>
+      <w:r>
+        <w:t xml:space="preserve"> de </w:t>
+      </w:r>
+      <w:proofErr w:type="spellStart"/>
+      <w:r>
+        <w:t>escala</w:t>
+      </w:r>
+      <w:proofErr w:type="spellEnd"/>
+      <w:r>
+        <w:t xml:space="preserve"> </w:t>
+      </w:r>
+      <w:proofErr w:type="spellStart"/>
+      <w:r>
+        <w:t>ao</w:t>
+      </w:r>
+      <w:proofErr w:type="spellEnd"/>
+      <w:r>
+        <w:t xml:space="preserve"> </w:t>
+      </w:r>
+      <w:proofErr w:type="spellStart"/>
+      <w:r>
+        <w:t>longo</w:t>
+      </w:r>
+      <w:proofErr w:type="spellEnd"/>
+      <w:r>
+        <w:t xml:space="preserve"> do tempo. O </w:t>
+      </w:r>
+      <w:proofErr w:type="spellStart"/>
+      <w:r>
+        <w:t>texto</w:t>
+      </w:r>
+      <w:proofErr w:type="spellEnd"/>
+      <w:r>
+        <w:t xml:space="preserve"> argumenta </w:t>
+      </w:r>
+      <w:proofErr w:type="spellStart"/>
+      <w:r>
+        <w:t>que</w:t>
+      </w:r>
+      <w:proofErr w:type="spellEnd"/>
+      <w:r>
+        <w:t xml:space="preserve"> </w:t>
+      </w:r>
+      <w:proofErr w:type="spellStart"/>
+      <w:r>
+        <w:t>essa</w:t>
+      </w:r>
+      <w:proofErr w:type="spellEnd"/>
+      <w:r>
+        <w:t xml:space="preserve"> nova </w:t>
+      </w:r>
+      <w:proofErr w:type="spellStart"/>
+      <w:r>
+        <w:t>perspectiva</w:t>
+      </w:r>
+      <w:proofErr w:type="spellEnd"/>
+      <w:r>
+        <w:t xml:space="preserve"> </w:t>
+      </w:r>
+      <w:proofErr w:type="spellStart"/>
+      <w:r>
+        <w:t>exige</w:t>
+      </w:r>
+      <w:proofErr w:type="spellEnd"/>
+      <w:r>
+        <w:t xml:space="preserve"> </w:t>
+      </w:r>
+      <w:proofErr w:type="spellStart"/>
+      <w:r>
+        <w:t>uma</w:t>
+      </w:r>
+      <w:proofErr w:type="spellEnd"/>
+      <w:r>
+        <w:t xml:space="preserve"> </w:t>
+      </w:r>
+      <w:proofErr w:type="spellStart"/>
+      <w:r>
+        <w:t>revisão</w:t>
+      </w:r>
+      <w:proofErr w:type="spellEnd"/>
+      <w:r>
+        <w:t xml:space="preserve"> da </w:t>
+      </w:r>
+      <w:proofErr w:type="spellStart"/>
+      <w:r>
+        <w:t>Relatividade</w:t>
+      </w:r>
+      <w:proofErr w:type="spellEnd"/>
+      <w:r>
+        <w:t xml:space="preserve"> Geral, </w:t>
+      </w:r>
+      <w:proofErr w:type="spellStart"/>
+      <w:r>
+        <w:t>permanecendo</w:t>
+      </w:r>
+      <w:proofErr w:type="spellEnd"/>
+      <w:r>
+        <w:t xml:space="preserve"> </w:t>
+      </w:r>
+      <w:proofErr w:type="spellStart"/>
+      <w:r>
+        <w:t>compatível</w:t>
+      </w:r>
+      <w:proofErr w:type="spellEnd"/>
+      <w:r>
+        <w:t xml:space="preserve"> com </w:t>
+      </w:r>
+      <w:proofErr w:type="spellStart"/>
+      <w:r>
+        <w:t>os</w:t>
+      </w:r>
+      <w:proofErr w:type="spellEnd"/>
+      <w:r>
+        <w:t xml:space="preserve"> </w:t>
+      </w:r>
+      <w:proofErr w:type="spellStart"/>
+      <w:r>
+        <w:t>princípios</w:t>
+      </w:r>
+      <w:proofErr w:type="spellEnd"/>
+      <w:r>
+        <w:t xml:space="preserve"> da </w:t>
+      </w:r>
+      <w:proofErr w:type="spellStart"/>
+      <w:r>
+        <w:t>Mecânica</w:t>
+      </w:r>
+      <w:proofErr w:type="spellEnd"/>
+      <w:r>
+        <w:t xml:space="preserve"> </w:t>
+      </w:r>
+      <w:proofErr w:type="spellStart"/>
+      <w:r>
+        <w:t>Quântica</w:t>
+      </w:r>
+      <w:proofErr w:type="spellEnd"/>
+      <w:r>
+        <w:t xml:space="preserve">. Por </w:t>
+      </w:r>
+      <w:proofErr w:type="spellStart"/>
+      <w:r>
+        <w:t>fim</w:t>
+      </w:r>
+      <w:proofErr w:type="spellEnd"/>
+      <w:r>
+        <w:t xml:space="preserve">, o </w:t>
+      </w:r>
+      <w:proofErr w:type="spellStart"/>
+      <w:r>
+        <w:t>autor</w:t>
+      </w:r>
+      <w:proofErr w:type="spellEnd"/>
+      <w:r>
+        <w:t xml:space="preserve"> </w:t>
+      </w:r>
+      <w:proofErr w:type="spellStart"/>
+      <w:r>
+        <w:t>esclarece</w:t>
+      </w:r>
+      <w:proofErr w:type="spellEnd"/>
+      <w:r>
+        <w:t xml:space="preserve"> </w:t>
+      </w:r>
+      <w:proofErr w:type="spellStart"/>
+      <w:r>
+        <w:t>perguntas</w:t>
+      </w:r>
+      <w:proofErr w:type="spellEnd"/>
+      <w:r>
+        <w:t xml:space="preserve"> </w:t>
+      </w:r>
+      <w:proofErr w:type="spellStart"/>
+      <w:r>
+        <w:t>frequentes</w:t>
+      </w:r>
+      <w:proofErr w:type="spellEnd"/>
+      <w:r>
+        <w:t xml:space="preserve"> para </w:t>
+      </w:r>
+      <w:proofErr w:type="spellStart"/>
+      <w:r>
+        <w:t>estabelecer</w:t>
+      </w:r>
+      <w:proofErr w:type="spellEnd"/>
+      <w:r>
+        <w:t xml:space="preserve"> a DUT </w:t>
+      </w:r>
+      <w:proofErr w:type="spellStart"/>
+      <w:r>
+        <w:t>como</w:t>
+      </w:r>
+      <w:proofErr w:type="spellEnd"/>
+      <w:r>
+        <w:t xml:space="preserve"> um </w:t>
+      </w:r>
+      <w:proofErr w:type="spellStart"/>
+      <w:r>
+        <w:t>arcabouço</w:t>
+      </w:r>
+      <w:proofErr w:type="spellEnd"/>
+      <w:r>
+        <w:t xml:space="preserve"> </w:t>
+      </w:r>
+      <w:proofErr w:type="spellStart"/>
+      <w:r>
+        <w:t>teórico</w:t>
+      </w:r>
+      <w:proofErr w:type="spellEnd"/>
+      <w:r>
+        <w:t xml:space="preserve"> alternativo e </w:t>
+      </w:r>
+      <w:proofErr w:type="spellStart"/>
+      <w:r>
+        <w:t>abrangente</w:t>
+      </w:r>
+      <w:proofErr w:type="spellEnd"/>
+      <w:r>
+        <w:t xml:space="preserve"> para a </w:t>
+      </w:r>
+      <w:proofErr w:type="spellStart"/>
+      <w:r>
+        <w:t>cosmologia</w:t>
+      </w:r>
+      <w:proofErr w:type="spellEnd"/>
+      <w:r>
+        <w:t xml:space="preserve"> moderna. “(</w:t>
+      </w:r>
+      <w:r>
+        <w:rPr>
+          <w:color w:val="EE0000"/>
+        </w:rPr>
+        <w:t>Jun/2026</w:t>
+      </w:r>
+      <w:r>
+        <w:t>)</w:t>
+      </w:r>
+    </w:p>
+    <w:p>
+      <w:pPr>
+        <w:pStyle w:val="Corpodetexto"/>
+        <w:pBdr>
+          <w:bottom w:val="single" w:sz="6" w:space="1" w:color="auto"/>
+        </w:pBdr>
+      </w:pPr>
+      <w:hyperlink r:id="rId35" w:history="1">
         <w:r>
           <w:rPr>
             <w:rStyle w:val="Hyperlink"/>
@@ -5131,6 +5211,20 @@
           <w:t>https://jocaxx.github.io/DUniverse/PORT/FAQ_DUT_POR.pdf</w:t>
         </w:r>
       </w:hyperlink>
+      <w:r>
+        <w:br/>
+      </w:r>
+      <w:r>
+        <w:br/>
+      </w:r>
+      <w:hyperlink r:id="rId36" w:history="1">
+        <w:r>
+          <w:rPr>
+            <w:rStyle w:val="Hyperlink"/>
+          </w:rPr>
+          <w:t>https://jocaxx.github.io/DUniverse/Html/POR_FAQ_DUT.htm</w:t>
+        </w:r>
+      </w:hyperlink>
     </w:p>
     <w:p>
       <w:pPr>
@@ -5338,7 +5432,7 @@
       <w:r>
         <w:br/>
       </w:r>
-      <w:hyperlink r:id="rId31" w:history="1">
+      <w:hyperlink r:id="rId37" w:history="1">
         <w:r>
           <w:rPr>
             <w:rStyle w:val="Hyperlink"/>
@@ -6144,7 +6238,7 @@
           <w:bottom w:val="single" w:sz="6" w:space="1" w:color="auto"/>
         </w:pBdr>
       </w:pPr>
-      <w:hyperlink r:id="rId32" w:history="1">
+      <w:hyperlink r:id="rId38" w:history="1">
         <w:r>
           <w:rPr>
             <w:rStyle w:val="Hyperlink"/>
@@ -6803,7 +6897,7 @@
           <w:bottom w:val="single" w:sz="6" w:space="1" w:color="auto"/>
         </w:pBdr>
       </w:pPr>
-      <w:hyperlink r:id="rId33" w:history="1">
+      <w:hyperlink r:id="rId39" w:history="1">
         <w:r>
           <w:rPr>
             <w:rStyle w:val="Hyperlink"/>
@@ -7323,7 +7417,7 @@
           <w:bottom w:val="single" w:sz="6" w:space="1" w:color="auto"/>
         </w:pBdr>
       </w:pPr>
-      <w:hyperlink r:id="rId34" w:history="1">
+      <w:hyperlink r:id="rId40" w:history="1">
         <w:r>
           <w:rPr>
             <w:rStyle w:val="Hyperlink"/>
@@ -7742,7 +7836,7 @@
           <w:bottom w:val="single" w:sz="6" w:space="1" w:color="auto"/>
         </w:pBdr>
       </w:pPr>
-      <w:hyperlink r:id="rId35" w:history="1">
+      <w:hyperlink r:id="rId41" w:history="1">
         <w:r>
           <w:rPr>
             <w:rStyle w:val="Hyperlink"/>
@@ -7959,7 +8053,7 @@
           <w:bottom w:val="single" w:sz="6" w:space="1" w:color="auto"/>
         </w:pBdr>
       </w:pPr>
-      <w:hyperlink r:id="rId36" w:history="1">
+      <w:hyperlink r:id="rId42" w:history="1">
         <w:r>
           <w:rPr>
             <w:rStyle w:val="Hyperlink"/>
@@ -8411,7 +8505,7 @@
           <w:bottom w:val="single" w:sz="6" w:space="1" w:color="auto"/>
         </w:pBdr>
       </w:pPr>
-      <w:hyperlink r:id="rId37" w:history="1">
+      <w:hyperlink r:id="rId43" w:history="1">
         <w:r>
           <w:rPr>
             <w:rStyle w:val="Hyperlink"/>
@@ -8767,7 +8861,7 @@
       <w:r>
         <w:br/>
       </w:r>
-      <w:hyperlink r:id="rId38" w:history="1">
+      <w:hyperlink r:id="rId44" w:history="1">
         <w:r>
           <w:rPr>
             <w:rStyle w:val="Hyperlink"/>
@@ -9039,7 +9133,7 @@
           <w:bottom w:val="single" w:sz="6" w:space="1" w:color="auto"/>
         </w:pBdr>
       </w:pPr>
-      <w:hyperlink r:id="rId39">
+      <w:hyperlink r:id="rId45">
         <w:r>
           <w:rPr>
             <w:rStyle w:val="Hyperlink"/>
@@ -9574,7 +9668,7 @@
           <w:bottom w:val="single" w:sz="6" w:space="1" w:color="auto"/>
         </w:pBdr>
       </w:pPr>
-      <w:hyperlink r:id="rId40">
+      <w:hyperlink r:id="rId46">
         <w:r>
           <w:rPr>
             <w:rStyle w:val="Hyperlink"/>
@@ -9590,236 +9684,25 @@
           <w:bottom w:val="single" w:sz="6" w:space="1" w:color="auto"/>
         </w:pBdr>
       </w:pPr>
-    </w:p>
-    <w:p>
-      <w:pPr>
-        <w:pStyle w:val="Corpodetexto"/>
-      </w:pPr>
-    </w:p>
-    <w:p>
-      <w:pPr>
-        <w:pStyle w:val="Corpodetexto"/>
-        <w:rPr>
-          <w:color w:val="17365D" w:themeColor="text2" w:themeShade="BF"/>
-          <w:sz w:val="28"/>
-          <w:szCs w:val="28"/>
-        </w:rPr>
-      </w:pPr>
-      <w:r>
-        <w:rPr>
-          <w:b/>
-          <w:bCs/>
-          <w:color w:val="17365D" w:themeColor="text2" w:themeShade="BF"/>
-          <w:sz w:val="28"/>
-          <w:szCs w:val="28"/>
-        </w:rPr>
-        <w:t xml:space="preserve">´O Campo </w:t>
-      </w:r>
-      <w:proofErr w:type="spellStart"/>
-      <w:r>
-        <w:rPr>
-          <w:b/>
-          <w:bCs/>
-          <w:color w:val="17365D" w:themeColor="text2" w:themeShade="BF"/>
-          <w:sz w:val="28"/>
-          <w:szCs w:val="28"/>
-        </w:rPr>
-        <w:t>Gravitacional</w:t>
-      </w:r>
-      <w:proofErr w:type="spellEnd"/>
-      <w:r>
-        <w:rPr>
-          <w:b/>
-          <w:bCs/>
-          <w:color w:val="17365D" w:themeColor="text2" w:themeShade="BF"/>
-          <w:sz w:val="28"/>
-          <w:szCs w:val="28"/>
-        </w:rPr>
-        <w:t xml:space="preserve"> e a Energia </w:t>
-      </w:r>
-      <w:proofErr w:type="spellStart"/>
-      <w:r>
-        <w:rPr>
-          <w:b/>
-          <w:bCs/>
-          <w:color w:val="17365D" w:themeColor="text2" w:themeShade="BF"/>
-          <w:sz w:val="28"/>
-          <w:szCs w:val="28"/>
-        </w:rPr>
-        <w:t>Escura</w:t>
-      </w:r>
-      <w:proofErr w:type="spellEnd"/>
-      <w:r>
-        <w:rPr>
-          <w:b/>
-          <w:bCs/>
-          <w:color w:val="17365D" w:themeColor="text2" w:themeShade="BF"/>
-          <w:sz w:val="28"/>
-          <w:szCs w:val="28"/>
-        </w:rPr>
-        <w:t>´</w:t>
-      </w:r>
-    </w:p>
-    <w:p>
-      <w:pPr>
-        <w:pStyle w:val="Corpodetexto"/>
-      </w:pPr>
-      <w:r>
-        <w:t>“</w:t>
-      </w:r>
-      <w:proofErr w:type="spellStart"/>
-      <w:r>
-        <w:t>Escrevo</w:t>
-      </w:r>
-      <w:proofErr w:type="spellEnd"/>
-      <w:r>
-        <w:t xml:space="preserve"> </w:t>
-      </w:r>
-      <w:proofErr w:type="spellStart"/>
-      <w:r>
-        <w:t>aqui</w:t>
-      </w:r>
-      <w:proofErr w:type="spellEnd"/>
-      <w:r>
-        <w:t xml:space="preserve"> </w:t>
-      </w:r>
-      <w:proofErr w:type="spellStart"/>
-      <w:r>
-        <w:t>sobre</w:t>
-      </w:r>
-      <w:proofErr w:type="spellEnd"/>
-      <w:r>
-        <w:t xml:space="preserve"> </w:t>
-      </w:r>
-      <w:proofErr w:type="spellStart"/>
-      <w:r>
-        <w:t>uma</w:t>
-      </w:r>
-      <w:proofErr w:type="spellEnd"/>
-      <w:r>
-        <w:t xml:space="preserve"> nova </w:t>
-      </w:r>
-      <w:proofErr w:type="spellStart"/>
-      <w:r>
-        <w:t>ideia</w:t>
-      </w:r>
-      <w:proofErr w:type="spellEnd"/>
-      <w:r>
-        <w:t xml:space="preserve"> de </w:t>
-      </w:r>
-      <w:proofErr w:type="spellStart"/>
-      <w:r>
-        <w:t>cosmologia</w:t>
-      </w:r>
-      <w:proofErr w:type="spellEnd"/>
-      <w:r>
-        <w:t xml:space="preserve"> </w:t>
-      </w:r>
-      <w:proofErr w:type="spellStart"/>
-      <w:r>
-        <w:t>que</w:t>
-      </w:r>
-      <w:proofErr w:type="spellEnd"/>
-      <w:r>
-        <w:t xml:space="preserve"> </w:t>
-      </w:r>
-      <w:proofErr w:type="spellStart"/>
-      <w:r>
-        <w:t>busca</w:t>
-      </w:r>
-      <w:proofErr w:type="spellEnd"/>
-      <w:r>
-        <w:t xml:space="preserve"> resolver o </w:t>
-      </w:r>
-      <w:proofErr w:type="spellStart"/>
-      <w:r>
-        <w:t>problema</w:t>
-      </w:r>
-      <w:proofErr w:type="spellEnd"/>
-      <w:r>
-        <w:t xml:space="preserve"> da </w:t>
-      </w:r>
-      <w:proofErr w:type="spellStart"/>
-      <w:r>
-        <w:t>energia</w:t>
-      </w:r>
-      <w:proofErr w:type="spellEnd"/>
-      <w:r>
-        <w:t xml:space="preserve"> </w:t>
-      </w:r>
-      <w:proofErr w:type="spellStart"/>
-      <w:r>
-        <w:t>escura</w:t>
-      </w:r>
-      <w:proofErr w:type="spellEnd"/>
-      <w:r>
-        <w:t xml:space="preserve"> e da </w:t>
-      </w:r>
-      <w:proofErr w:type="spellStart"/>
-      <w:r>
-        <w:t>matéria</w:t>
-      </w:r>
-      <w:proofErr w:type="spellEnd"/>
-      <w:r>
-        <w:t xml:space="preserve"> </w:t>
-      </w:r>
-      <w:proofErr w:type="spellStart"/>
-      <w:r>
-        <w:t>escura</w:t>
-      </w:r>
-      <w:proofErr w:type="spellEnd"/>
-      <w:r>
-        <w:t xml:space="preserve">, </w:t>
-      </w:r>
-      <w:proofErr w:type="spellStart"/>
-      <w:r>
-        <w:t>eliminando</w:t>
-      </w:r>
-      <w:proofErr w:type="spellEnd"/>
-      <w:r>
-        <w:t xml:space="preserve"> a </w:t>
-      </w:r>
-      <w:proofErr w:type="spellStart"/>
-      <w:r>
-        <w:t>necessidade</w:t>
-      </w:r>
-      <w:proofErr w:type="spellEnd"/>
-      <w:r>
-        <w:t xml:space="preserve"> de </w:t>
-      </w:r>
-      <w:proofErr w:type="spellStart"/>
-      <w:r>
-        <w:t>postular</w:t>
-      </w:r>
-      <w:proofErr w:type="spellEnd"/>
-      <w:r>
-        <w:t xml:space="preserve"> </w:t>
-      </w:r>
-      <w:proofErr w:type="spellStart"/>
-      <w:r>
-        <w:t>sua</w:t>
-      </w:r>
-      <w:proofErr w:type="spellEnd"/>
-      <w:r>
-        <w:t xml:space="preserve"> </w:t>
-      </w:r>
-      <w:proofErr w:type="spellStart"/>
-      <w:r>
-        <w:t>existência</w:t>
-      </w:r>
-      <w:proofErr w:type="spellEnd"/>
-      <w:r>
-        <w:t>. (</w:t>
-      </w:r>
-      <w:r>
-        <w:rPr>
-          <w:color w:val="EE0000"/>
-        </w:rPr>
-        <w:t>Jul/2016</w:t>
-      </w:r>
-      <w:r>
-        <w:t>)</w:t>
-      </w:r>
+      <w:proofErr w:type="spellStart"/>
+      <w:r>
+        <w:t>Vídeo</w:t>
+      </w:r>
+      <w:proofErr w:type="spellEnd"/>
+      <w:r>
+        <w:t xml:space="preserve"> </w:t>
+      </w:r>
+      <w:r>
+        <w:t xml:space="preserve">: </w:t>
+      </w:r>
+      <w:hyperlink r:id="rId47" w:history="1">
+        <w:r>
+          <w:rPr>
+            <w:rStyle w:val="Hyperlink"/>
+          </w:rPr>
+          <w:t>https://www.youtube.com/watch?v=qu7mTDB4T6U</w:t>
+        </w:r>
+      </w:hyperlink>
     </w:p>
     <w:p>
       <w:pPr>
@@ -9828,7 +9711,245 @@
           <w:bottom w:val="single" w:sz="6" w:space="1" w:color="auto"/>
         </w:pBdr>
       </w:pPr>
-      <w:hyperlink r:id="rId41">
+    </w:p>
+    <w:p>
+      <w:pPr>
+        <w:pStyle w:val="Corpodetexto"/>
+      </w:pPr>
+    </w:p>
+    <w:p>
+      <w:pPr>
+        <w:pStyle w:val="Corpodetexto"/>
+        <w:rPr>
+          <w:color w:val="17365D" w:themeColor="text2" w:themeShade="BF"/>
+          <w:sz w:val="28"/>
+          <w:szCs w:val="28"/>
+        </w:rPr>
+      </w:pPr>
+      <w:r>
+        <w:rPr>
+          <w:b/>
+          <w:bCs/>
+          <w:color w:val="17365D" w:themeColor="text2" w:themeShade="BF"/>
+          <w:sz w:val="28"/>
+          <w:szCs w:val="28"/>
+        </w:rPr>
+        <w:t xml:space="preserve">´O Campo </w:t>
+      </w:r>
+      <w:proofErr w:type="spellStart"/>
+      <w:r>
+        <w:rPr>
+          <w:b/>
+          <w:bCs/>
+          <w:color w:val="17365D" w:themeColor="text2" w:themeShade="BF"/>
+          <w:sz w:val="28"/>
+          <w:szCs w:val="28"/>
+        </w:rPr>
+        <w:t>Gravitacional</w:t>
+      </w:r>
+      <w:proofErr w:type="spellEnd"/>
+      <w:r>
+        <w:rPr>
+          <w:b/>
+          <w:bCs/>
+          <w:color w:val="17365D" w:themeColor="text2" w:themeShade="BF"/>
+          <w:sz w:val="28"/>
+          <w:szCs w:val="28"/>
+        </w:rPr>
+        <w:t xml:space="preserve"> e a Energia </w:t>
+      </w:r>
+      <w:proofErr w:type="spellStart"/>
+      <w:r>
+        <w:rPr>
+          <w:b/>
+          <w:bCs/>
+          <w:color w:val="17365D" w:themeColor="text2" w:themeShade="BF"/>
+          <w:sz w:val="28"/>
+          <w:szCs w:val="28"/>
+        </w:rPr>
+        <w:t>Escura</w:t>
+      </w:r>
+      <w:proofErr w:type="spellEnd"/>
+      <w:r>
+        <w:rPr>
+          <w:b/>
+          <w:bCs/>
+          <w:color w:val="17365D" w:themeColor="text2" w:themeShade="BF"/>
+          <w:sz w:val="28"/>
+          <w:szCs w:val="28"/>
+        </w:rPr>
+        <w:t>´</w:t>
+      </w:r>
+    </w:p>
+    <w:p>
+      <w:pPr>
+        <w:pStyle w:val="Corpodetexto"/>
+      </w:pPr>
+      <w:r>
+        <w:t>“</w:t>
+      </w:r>
+      <w:proofErr w:type="spellStart"/>
+      <w:r>
+        <w:t>Escrevo</w:t>
+      </w:r>
+      <w:proofErr w:type="spellEnd"/>
+      <w:r>
+        <w:t xml:space="preserve"> </w:t>
+      </w:r>
+      <w:proofErr w:type="spellStart"/>
+      <w:r>
+        <w:t>aqui</w:t>
+      </w:r>
+      <w:proofErr w:type="spellEnd"/>
+      <w:r>
+        <w:t xml:space="preserve"> </w:t>
+      </w:r>
+      <w:proofErr w:type="spellStart"/>
+      <w:r>
+        <w:t>sobre</w:t>
+      </w:r>
+      <w:proofErr w:type="spellEnd"/>
+      <w:r>
+        <w:t xml:space="preserve"> </w:t>
+      </w:r>
+      <w:proofErr w:type="spellStart"/>
+      <w:r>
+        <w:t>uma</w:t>
+      </w:r>
+      <w:proofErr w:type="spellEnd"/>
+      <w:r>
+        <w:t xml:space="preserve"> nova </w:t>
+      </w:r>
+      <w:proofErr w:type="spellStart"/>
+      <w:r>
+        <w:t>ideia</w:t>
+      </w:r>
+      <w:proofErr w:type="spellEnd"/>
+      <w:r>
+        <w:t xml:space="preserve"> de </w:t>
+      </w:r>
+      <w:proofErr w:type="spellStart"/>
+      <w:r>
+        <w:t>cosmologia</w:t>
+      </w:r>
+      <w:proofErr w:type="spellEnd"/>
+      <w:r>
+        <w:t xml:space="preserve"> </w:t>
+      </w:r>
+      <w:proofErr w:type="spellStart"/>
+      <w:r>
+        <w:t>que</w:t>
+      </w:r>
+      <w:proofErr w:type="spellEnd"/>
+      <w:r>
+        <w:t xml:space="preserve"> </w:t>
+      </w:r>
+      <w:proofErr w:type="spellStart"/>
+      <w:r>
+        <w:t>busca</w:t>
+      </w:r>
+      <w:proofErr w:type="spellEnd"/>
+      <w:r>
+        <w:t xml:space="preserve"> resolver o </w:t>
+      </w:r>
+      <w:proofErr w:type="spellStart"/>
+      <w:r>
+        <w:t>problema</w:t>
+      </w:r>
+      <w:proofErr w:type="spellEnd"/>
+      <w:r>
+        <w:t xml:space="preserve"> da </w:t>
+      </w:r>
+      <w:proofErr w:type="spellStart"/>
+      <w:r>
+        <w:t>energia</w:t>
+      </w:r>
+      <w:proofErr w:type="spellEnd"/>
+      <w:r>
+        <w:t xml:space="preserve"> </w:t>
+      </w:r>
+      <w:proofErr w:type="spellStart"/>
+      <w:r>
+        <w:t>escura</w:t>
+      </w:r>
+      <w:proofErr w:type="spellEnd"/>
+      <w:r>
+        <w:t xml:space="preserve"> e da </w:t>
+      </w:r>
+      <w:proofErr w:type="spellStart"/>
+      <w:r>
+        <w:t>matéria</w:t>
+      </w:r>
+      <w:proofErr w:type="spellEnd"/>
+      <w:r>
+        <w:t xml:space="preserve"> </w:t>
+      </w:r>
+      <w:proofErr w:type="spellStart"/>
+      <w:r>
+        <w:t>escura</w:t>
+      </w:r>
+      <w:proofErr w:type="spellEnd"/>
+      <w:r>
+        <w:t xml:space="preserve">, </w:t>
+      </w:r>
+      <w:proofErr w:type="spellStart"/>
+      <w:r>
+        <w:t>eliminando</w:t>
+      </w:r>
+      <w:proofErr w:type="spellEnd"/>
+      <w:r>
+        <w:t xml:space="preserve"> a </w:t>
+      </w:r>
+      <w:proofErr w:type="spellStart"/>
+      <w:r>
+        <w:t>necessidade</w:t>
+      </w:r>
+      <w:proofErr w:type="spellEnd"/>
+      <w:r>
+        <w:t xml:space="preserve"> de </w:t>
+      </w:r>
+      <w:proofErr w:type="spellStart"/>
+      <w:r>
+        <w:t>postular</w:t>
+      </w:r>
+      <w:proofErr w:type="spellEnd"/>
+      <w:r>
+        <w:t xml:space="preserve"> </w:t>
+      </w:r>
+      <w:proofErr w:type="spellStart"/>
+      <w:r>
+        <w:t>sua</w:t>
+      </w:r>
+      <w:proofErr w:type="spellEnd"/>
+      <w:r>
+        <w:t xml:space="preserve"> </w:t>
+      </w:r>
+      <w:proofErr w:type="spellStart"/>
+      <w:r>
+        <w:t>existência</w:t>
+      </w:r>
+      <w:proofErr w:type="spellEnd"/>
+      <w:r>
+        <w:t>. (</w:t>
+      </w:r>
+      <w:r>
+        <w:rPr>
+          <w:color w:val="EE0000"/>
+        </w:rPr>
+        <w:t>Jul/2016</w:t>
+      </w:r>
+      <w:r>
+        <w:t>)</w:t>
+      </w:r>
+    </w:p>
+    <w:p>
+      <w:pPr>
+        <w:pStyle w:val="Corpodetexto"/>
+        <w:pBdr>
+          <w:bottom w:val="single" w:sz="6" w:space="1" w:color="auto"/>
+        </w:pBdr>
+      </w:pPr>
+      <w:hyperlink r:id="rId48">
         <w:r>
           <w:rPr>
             <w:rStyle w:val="Hyperlink"/>
@@ -9842,7 +9963,7 @@
       <w:r>
         <w:br/>
       </w:r>
-      <w:hyperlink r:id="rId42">
+      <w:hyperlink r:id="rId49">
         <w:r>
           <w:rPr>
             <w:rStyle w:val="Hyperlink"/>
@@ -10102,7 +10223,7 @@
           <w:bottom w:val="single" w:sz="6" w:space="1" w:color="auto"/>
         </w:pBdr>
       </w:pPr>
-      <w:hyperlink r:id="rId43" w:history="1">
+      <w:hyperlink r:id="rId50" w:history="1">
         <w:r>
           <w:rPr>
             <w:rStyle w:val="Hyperlink"/>
@@ -10344,7 +10465,7 @@
           <w:bottom w:val="single" w:sz="6" w:space="1" w:color="auto"/>
         </w:pBdr>
       </w:pPr>
-      <w:hyperlink r:id="rId44" w:history="1">
+      <w:hyperlink r:id="rId51" w:history="1">
         <w:r>
           <w:rPr>
             <w:rStyle w:val="Hyperlink"/>
@@ -10614,7 +10735,7 @@
           <w:bottom w:val="single" w:sz="6" w:space="1" w:color="auto"/>
         </w:pBdr>
       </w:pPr>
-      <w:hyperlink r:id="rId45" w:history="1">
+      <w:hyperlink r:id="rId52" w:history="1">
         <w:r>
           <w:rPr>
             <w:rStyle w:val="Hyperlink"/>
@@ -10696,7 +10817,7 @@
           <w:bottom w:val="single" w:sz="6" w:space="1" w:color="auto"/>
         </w:pBdr>
       </w:pPr>
-      <w:hyperlink r:id="rId46" w:history="1">
+      <w:hyperlink r:id="rId53" w:history="1">
         <w:r>
           <w:rPr>
             <w:rStyle w:val="Hyperlink"/>
@@ -10833,7 +10954,7 @@
           <w:bottom w:val="single" w:sz="6" w:space="1" w:color="auto"/>
         </w:pBdr>
       </w:pPr>
-      <w:hyperlink r:id="rId47" w:history="1">
+      <w:hyperlink r:id="rId54" w:history="1">
         <w:r>
           <w:rPr>
             <w:rStyle w:val="Hyperlink"/>
@@ -10936,7 +11057,7 @@
       <w:r>
         <w:t>Texto:</w:t>
       </w:r>
-      <w:hyperlink r:id="rId48">
+      <w:hyperlink r:id="rId55">
         <w:r>
           <w:rPr>
             <w:rStyle w:val="Hyperlink"/>
@@ -10969,7 +11090,7 @@
         <w:br/>
         <w:t>VID1:</w:t>
       </w:r>
-      <w:hyperlink r:id="rId49">
+      <w:hyperlink r:id="rId56">
         <w:r>
           <w:rPr>
             <w:rStyle w:val="Hyperlink"/>
@@ -10981,7 +11102,7 @@
         <w:br/>
         <w:t>VID2:</w:t>
       </w:r>
-      <w:hyperlink r:id="rId50">
+      <w:hyperlink r:id="rId57">
         <w:r>
           <w:rPr>
             <w:rStyle w:val="Hyperlink"/>
@@ -11048,7 +11169,7 @@
       <w:r>
         <w:br/>
       </w:r>
-      <w:hyperlink r:id="rId51">
+      <w:hyperlink r:id="rId58">
         <w:r>
           <w:rPr>
             <w:rStyle w:val="Hyperlink"/>
@@ -11249,7 +11370,7 @@
       <w:pPr>
         <w:pStyle w:val="Corpodetexto"/>
       </w:pPr>
-      <w:hyperlink r:id="rId52">
+      <w:hyperlink r:id="rId59">
         <w:r>
           <w:rPr>
             <w:rStyle w:val="Hyperlink"/>
@@ -11268,7 +11389,7 @@
       <w:r>
         <w:br/>
       </w:r>
-      <w:hyperlink r:id="rId53">
+      <w:hyperlink r:id="rId60">
         <w:r>
           <w:rPr>
             <w:rStyle w:val="Hyperlink"/>
@@ -11300,7 +11421,7 @@
       <w:r>
         <w:t xml:space="preserve">: </w:t>
       </w:r>
-      <w:hyperlink r:id="rId54">
+      <w:hyperlink r:id="rId61">
         <w:r>
           <w:rPr>
             <w:rStyle w:val="Hyperlink"/>
@@ -11326,7 +11447,7 @@
       <w:r>
         <w:t xml:space="preserve"> </w:t>
       </w:r>
-      <w:hyperlink r:id="rId55">
+      <w:hyperlink r:id="rId62">
         <w:r>
           <w:rPr>
             <w:rStyle w:val="Hyperlink"/>

</xml_diff>